<commit_message>
Day1 Tokenisation line and word tokenization
</commit_message>
<xml_diff>
--- a/plan d'apprentissage.docx
+++ b/plan d'apprentissage.docx
@@ -31,31 +31,19 @@
           <w:ilvl w:val="0"/>
           <w:numId w:val="1"/>
         </w:numPr>
-      </w:pPr>
-      <w:r>
+        <w:rPr>
+          <w:highlight w:val="yellow"/>
+        </w:rPr>
+      </w:pPr>
+      <w:r>
+        <w:rPr>
+          <w:highlight w:val="yellow"/>
+        </w:rPr>
         <w:t>Qu’est-ce que le NLP ?</w:t>
       </w:r>
     </w:p>
     <w:p>
       <w:pPr>
-        <w:numPr>
-          <w:ilvl w:val="0"/>
-          <w:numId w:val="1"/>
-        </w:numPr>
-      </w:pPr>
-      <w:r>
-        <w:t>Différence NLP classique vs NLP moderne</w:t>
-      </w:r>
-    </w:p>
-    <w:p>
-      <w:r>
-        <w:pict w14:anchorId="41B6C200">
-          <v:rect id="_x0000_i1091" style="width:0;height:1.5pt" o:hralign="center" o:hrstd="t" o:hr="t" fillcolor="#a0a0a0" stroked="f"/>
-        </w:pict>
-      </w:r>
-    </w:p>
-    <w:p>
-      <w:pPr>
         <w:rPr>
           <w:b/>
           <w:bCs/>
@@ -220,7 +208,7 @@
     <w:p>
       <w:r>
         <w:pict w14:anchorId="1B3D4F1F">
-          <v:rect id="_x0000_i1116" style="width:0;height:1.5pt" o:hralign="center" o:hrstd="t" o:hr="t" fillcolor="#a0a0a0" stroked="f"/>
+          <v:rect id="_x0000_i1026" style="width:0;height:1.5pt" o:hralign="center" o:hrstd="t" o:hr="t" fillcolor="#a0a0a0" stroked="f"/>
         </w:pict>
       </w:r>
     </w:p>
@@ -460,41 +448,41 @@
           <w:b/>
           <w:bCs/>
         </w:rPr>
+        <w:t xml:space="preserve">Lemmatisation &amp; </w:t>
+      </w:r>
+      <w:proofErr w:type="spellStart"/>
+      <w:r>
+        <w:rPr>
+          <w:b/>
+          <w:bCs/>
+        </w:rPr>
+        <w:t>stemming</w:t>
+      </w:r>
+      <w:proofErr w:type="spellEnd"/>
+    </w:p>
+    <w:p>
+      <w:pPr>
+        <w:numPr>
+          <w:ilvl w:val="0"/>
+          <w:numId w:val="7"/>
+        </w:numPr>
+      </w:pPr>
+      <w:proofErr w:type="gramStart"/>
+      <w:r>
+        <w:t>différences</w:t>
+      </w:r>
+      <w:proofErr w:type="gramEnd"/>
+    </w:p>
+    <w:p>
+      <w:pPr>
+        <w:numPr>
+          <w:ilvl w:val="0"/>
+          <w:numId w:val="7"/>
+        </w:numPr>
+      </w:pPr>
+      <w:proofErr w:type="gramStart"/>
+      <w:r>
         <w:lastRenderedPageBreak/>
-        <w:t xml:space="preserve">Lemmatisation &amp; </w:t>
-      </w:r>
-      <w:proofErr w:type="spellStart"/>
-      <w:r>
-        <w:rPr>
-          <w:b/>
-          <w:bCs/>
-        </w:rPr>
-        <w:t>stemming</w:t>
-      </w:r>
-      <w:proofErr w:type="spellEnd"/>
-    </w:p>
-    <w:p>
-      <w:pPr>
-        <w:numPr>
-          <w:ilvl w:val="0"/>
-          <w:numId w:val="7"/>
-        </w:numPr>
-      </w:pPr>
-      <w:proofErr w:type="gramStart"/>
-      <w:r>
-        <w:t>différences</w:t>
-      </w:r>
-      <w:proofErr w:type="gramEnd"/>
-    </w:p>
-    <w:p>
-      <w:pPr>
-        <w:numPr>
-          <w:ilvl w:val="0"/>
-          <w:numId w:val="7"/>
-        </w:numPr>
-      </w:pPr>
-      <w:proofErr w:type="gramStart"/>
-      <w:r>
         <w:t>algorithmes</w:t>
       </w:r>
       <w:proofErr w:type="gramEnd"/>
@@ -612,7 +600,7 @@
     <w:p>
       <w:r>
         <w:pict w14:anchorId="1A1118ED">
-          <v:rect id="_x0000_i1093" style="width:0;height:1.5pt" o:hralign="center" o:hrstd="t" o:hr="t" fillcolor="#a0a0a0" stroked="f"/>
+          <v:rect id="_x0000_i1027" style="width:0;height:1.5pt" o:hralign="center" o:hrstd="t" o:hr="t" fillcolor="#a0a0a0" stroked="f"/>
         </w:pict>
       </w:r>
     </w:p>
@@ -907,7 +895,7 @@
     <w:p>
       <w:r>
         <w:pict w14:anchorId="1CF60C93">
-          <v:rect id="_x0000_i1094" style="width:0;height:1.5pt" o:hralign="center" o:hrstd="t" o:hr="t" fillcolor="#a0a0a0" stroked="f"/>
+          <v:rect id="_x0000_i1028" style="width:0;height:1.5pt" o:hralign="center" o:hrstd="t" o:hr="t" fillcolor="#a0a0a0" stroked="f"/>
         </w:pict>
       </w:r>
     </w:p>
@@ -1205,7 +1193,7 @@
     <w:p>
       <w:r>
         <w:pict w14:anchorId="264D1A07">
-          <v:rect id="_x0000_i1095" style="width:0;height:1.5pt" o:hralign="center" o:hrstd="t" o:hr="t" fillcolor="#a0a0a0" stroked="f"/>
+          <v:rect id="_x0000_i1029" style="width:0;height:1.5pt" o:hralign="center" o:hrstd="t" o:hr="t" fillcolor="#a0a0a0" stroked="f"/>
         </w:pict>
       </w:r>
     </w:p>
@@ -1475,7 +1463,7 @@
     <w:p>
       <w:r>
         <w:pict w14:anchorId="76EC41FA">
-          <v:rect id="_x0000_i1096" style="width:0;height:1.5pt" o:hralign="center" o:hrstd="t" o:hr="t" fillcolor="#a0a0a0" stroked="f"/>
+          <v:rect id="_x0000_i1030" style="width:0;height:1.5pt" o:hralign="center" o:hrstd="t" o:hr="t" fillcolor="#a0a0a0" stroked="f"/>
         </w:pict>
       </w:r>
     </w:p>
@@ -1764,7 +1752,7 @@
     <w:p>
       <w:r>
         <w:pict w14:anchorId="60ABFFF1">
-          <v:rect id="_x0000_i1097" style="width:0;height:1.5pt" o:hralign="center" o:hrstd="t" o:hr="t" fillcolor="#a0a0a0" stroked="f"/>
+          <v:rect id="_x0000_i1031" style="width:0;height:1.5pt" o:hralign="center" o:hrstd="t" o:hr="t" fillcolor="#a0a0a0" stroked="f"/>
         </w:pict>
       </w:r>
     </w:p>
@@ -2063,7 +2051,7 @@
     <w:p>
       <w:r>
         <w:pict w14:anchorId="41869E96">
-          <v:rect id="_x0000_i1098" style="width:0;height:1.5pt" o:hralign="center" o:hrstd="t" o:hr="t" fillcolor="#a0a0a0" stroked="f"/>
+          <v:rect id="_x0000_i1032" style="width:0;height:1.5pt" o:hralign="center" o:hrstd="t" o:hr="t" fillcolor="#a0a0a0" stroked="f"/>
         </w:pict>
       </w:r>
     </w:p>
@@ -2250,7 +2238,7 @@
     <w:p>
       <w:r>
         <w:pict w14:anchorId="647EB8C1">
-          <v:rect id="_x0000_i1099" style="width:0;height:1.5pt" o:hralign="center" o:hrstd="t" o:hr="t" fillcolor="#a0a0a0" stroked="f"/>
+          <v:rect id="_x0000_i1033" style="width:0;height:1.5pt" o:hralign="center" o:hrstd="t" o:hr="t" fillcolor="#a0a0a0" stroked="f"/>
         </w:pict>
       </w:r>
     </w:p>
@@ -2543,7 +2531,7 @@
     <w:p>
       <w:r>
         <w:pict w14:anchorId="6C82C344">
-          <v:rect id="_x0000_i1100" style="width:0;height:1.5pt" o:hralign="center" o:hrstd="t" o:hr="t" fillcolor="#a0a0a0" stroked="f"/>
+          <v:rect id="_x0000_i1034" style="width:0;height:1.5pt" o:hralign="center" o:hrstd="t" o:hr="t" fillcolor="#a0a0a0" stroked="f"/>
         </w:pict>
       </w:r>
     </w:p>
@@ -2754,7 +2742,7 @@
     <w:p>
       <w:r>
         <w:pict w14:anchorId="6F89EAE8">
-          <v:rect id="_x0000_i1101" style="width:0;height:1.5pt" o:hralign="center" o:hrstd="t" o:hr="t" fillcolor="#a0a0a0" stroked="f"/>
+          <v:rect id="_x0000_i1035" style="width:0;height:1.5pt" o:hralign="center" o:hrstd="t" o:hr="t" fillcolor="#a0a0a0" stroked="f"/>
         </w:pict>
       </w:r>
     </w:p>
@@ -9243,6 +9231,7 @@
   <w:style w:type="character" w:default="1" w:styleId="Policepardfaut">
     <w:name w:val="Default Paragraph Font"/>
     <w:uiPriority w:val="1"/>
+    <w:semiHidden/>
     <w:unhideWhenUsed/>
   </w:style>
   <w:style w:type="table" w:default="1" w:styleId="TableauNormal">

</xml_diff>

<commit_message>
Day3,4 and 5 :stopwords, gestion des langues, bag of words, N-grams, RF-IDF
</commit_message>
<xml_diff>
--- a/plan d'apprentissage.docx
+++ b/plan d'apprentissage.docx
@@ -66,97 +66,20 @@
       </w:r>
     </w:p>
     <w:p>
-      <w:r>
-        <w:rPr>
-          <w:b/>
-          <w:bCs/>
-        </w:rPr>
-        <w:t>Souvent ignorée mais essentielle</w:t>
-      </w:r>
-    </w:p>
-    <w:p>
-      <w:pPr>
-        <w:rPr>
-          <w:b/>
-          <w:bCs/>
-        </w:rPr>
-      </w:pPr>
-      <w:r>
-        <w:rPr>
-          <w:b/>
-          <w:bCs/>
-        </w:rPr>
-        <w:t>Linguistique pour NLP :</w:t>
-      </w:r>
-    </w:p>
-    <w:p>
-      <w:pPr>
-        <w:numPr>
-          <w:ilvl w:val="0"/>
-          <w:numId w:val="2"/>
-        </w:numPr>
-      </w:pPr>
-      <w:r>
-        <w:t>Morphologie</w:t>
-      </w:r>
-    </w:p>
-    <w:p>
-      <w:pPr>
-        <w:numPr>
-          <w:ilvl w:val="0"/>
-          <w:numId w:val="2"/>
-        </w:numPr>
-      </w:pPr>
-      <w:r>
-        <w:t>Syntaxe</w:t>
-      </w:r>
-    </w:p>
-    <w:p>
-      <w:pPr>
-        <w:numPr>
-          <w:ilvl w:val="0"/>
-          <w:numId w:val="2"/>
-        </w:numPr>
-      </w:pPr>
-      <w:r>
-        <w:t>Sémantique</w:t>
-      </w:r>
-    </w:p>
-    <w:p>
-      <w:pPr>
-        <w:numPr>
-          <w:ilvl w:val="0"/>
-          <w:numId w:val="2"/>
-        </w:numPr>
-      </w:pPr>
-      <w:r>
-        <w:t>Pragmatique</w:t>
-      </w:r>
-    </w:p>
-    <w:p>
-      <w:pPr>
-        <w:rPr>
-          <w:b/>
-          <w:bCs/>
-        </w:rPr>
-      </w:pPr>
-      <w:r>
-        <w:rPr>
-          <w:b/>
-          <w:bCs/>
-        </w:rPr>
-        <w:t>Concepts clés :</w:t>
-      </w:r>
-    </w:p>
-    <w:p>
       <w:pPr>
         <w:numPr>
           <w:ilvl w:val="0"/>
           <w:numId w:val="3"/>
         </w:numPr>
+        <w:rPr>
+          <w:highlight w:val="yellow"/>
+        </w:rPr>
       </w:pPr>
       <w:proofErr w:type="spellStart"/>
       <w:r>
+        <w:rPr>
+          <w:highlight w:val="yellow"/>
+        </w:rPr>
         <w:t>Token</w:t>
       </w:r>
       <w:proofErr w:type="spellEnd"/>
@@ -167,8 +90,14 @@
           <w:ilvl w:val="0"/>
           <w:numId w:val="3"/>
         </w:numPr>
-      </w:pPr>
-      <w:r>
+        <w:rPr>
+          <w:highlight w:val="yellow"/>
+        </w:rPr>
+      </w:pPr>
+      <w:r>
+        <w:rPr>
+          <w:highlight w:val="yellow"/>
+        </w:rPr>
         <w:t>Phrase</w:t>
       </w:r>
     </w:p>
@@ -178,8 +107,14 @@
           <w:ilvl w:val="0"/>
           <w:numId w:val="3"/>
         </w:numPr>
-      </w:pPr>
-      <w:r>
+        <w:rPr>
+          <w:highlight w:val="yellow"/>
+        </w:rPr>
+      </w:pPr>
+      <w:r>
+        <w:rPr>
+          <w:highlight w:val="yellow"/>
+        </w:rPr>
         <w:t>Corpus</w:t>
       </w:r>
     </w:p>
@@ -189,8 +124,14 @@
           <w:ilvl w:val="0"/>
           <w:numId w:val="3"/>
         </w:numPr>
-      </w:pPr>
-      <w:r>
+        <w:rPr>
+          <w:highlight w:val="yellow"/>
+        </w:rPr>
+      </w:pPr>
+      <w:r>
+        <w:rPr>
+          <w:highlight w:val="yellow"/>
+        </w:rPr>
         <w:t>Lexique</w:t>
       </w:r>
     </w:p>
@@ -200,15 +141,21 @@
           <w:ilvl w:val="0"/>
           <w:numId w:val="3"/>
         </w:numPr>
-      </w:pPr>
-      <w:r>
+        <w:rPr>
+          <w:highlight w:val="yellow"/>
+        </w:rPr>
+      </w:pPr>
+      <w:r>
+        <w:rPr>
+          <w:highlight w:val="yellow"/>
+        </w:rPr>
         <w:t>Grammaires formelles</w:t>
       </w:r>
     </w:p>
     <w:p>
       <w:r>
         <w:pict w14:anchorId="1B3D4F1F">
-          <v:rect id="_x0000_i1026" style="width:0;height:1.5pt" o:hralign="center" o:hrstd="t" o:hr="t" fillcolor="#a0a0a0" stroked="f"/>
+          <v:rect id="_x0000_i1025" style="width:0;height:1.5pt" o:hralign="center" o:hrstd="t" o:hr="t" fillcolor="#a0a0a0" stroked="f"/>
         </w:pict>
       </w:r>
     </w:p>
@@ -236,25 +183,18 @@
       </w:r>
     </w:p>
     <w:p>
-      <w:r>
-        <w:rPr>
-          <w:b/>
-          <w:bCs/>
-        </w:rPr>
-        <w:t>Base de tout pipeline NLP</w:t>
-      </w:r>
-    </w:p>
-    <w:p>
-      <w:pPr>
-        <w:rPr>
-          <w:b/>
-          <w:bCs/>
-        </w:rPr>
-      </w:pPr>
-      <w:r>
-        <w:rPr>
-          <w:b/>
-          <w:bCs/>
+      <w:pPr>
+        <w:rPr>
+          <w:b/>
+          <w:bCs/>
+          <w:highlight w:val="yellow"/>
+        </w:rPr>
+      </w:pPr>
+      <w:r>
+        <w:rPr>
+          <w:b/>
+          <w:bCs/>
+          <w:highlight w:val="yellow"/>
         </w:rPr>
         <w:t>Nettoyage :</w:t>
       </w:r>
@@ -265,10 +205,16 @@
           <w:ilvl w:val="0"/>
           <w:numId w:val="4"/>
         </w:numPr>
+        <w:rPr>
+          <w:highlight w:val="yellow"/>
+        </w:rPr>
       </w:pPr>
       <w:proofErr w:type="spellStart"/>
       <w:proofErr w:type="gramStart"/>
       <w:r>
+        <w:rPr>
+          <w:highlight w:val="yellow"/>
+        </w:rPr>
         <w:t>lowercasing</w:t>
       </w:r>
       <w:proofErr w:type="spellEnd"/>
@@ -280,13 +226,22 @@
           <w:ilvl w:val="0"/>
           <w:numId w:val="4"/>
         </w:numPr>
+        <w:rPr>
+          <w:highlight w:val="yellow"/>
+        </w:rPr>
       </w:pPr>
       <w:proofErr w:type="gramStart"/>
       <w:r>
+        <w:rPr>
+          <w:highlight w:val="yellow"/>
+        </w:rPr>
         <w:t>suppression</w:t>
       </w:r>
       <w:proofErr w:type="gramEnd"/>
       <w:r>
+        <w:rPr>
+          <w:highlight w:val="yellow"/>
+        </w:rPr>
         <w:t xml:space="preserve"> ponctuation</w:t>
       </w:r>
     </w:p>
@@ -296,211 +251,106 @@
           <w:ilvl w:val="0"/>
           <w:numId w:val="4"/>
         </w:numPr>
+        <w:rPr>
+          <w:highlight w:val="yellow"/>
+        </w:rPr>
       </w:pPr>
       <w:proofErr w:type="gramStart"/>
       <w:r>
+        <w:rPr>
+          <w:highlight w:val="yellow"/>
+        </w:rPr>
         <w:t>suppression</w:t>
       </w:r>
       <w:proofErr w:type="gramEnd"/>
       <w:r>
+        <w:rPr>
+          <w:highlight w:val="yellow"/>
+        </w:rPr>
         <w:t xml:space="preserve"> chiffres</w:t>
       </w:r>
     </w:p>
     <w:p>
       <w:pPr>
-        <w:numPr>
-          <w:ilvl w:val="0"/>
-          <w:numId w:val="4"/>
-        </w:numPr>
-      </w:pPr>
-      <w:proofErr w:type="gramStart"/>
-      <w:r>
-        <w:t>normalisation</w:t>
-      </w:r>
-      <w:proofErr w:type="gramEnd"/>
-    </w:p>
-    <w:p>
-      <w:pPr>
-        <w:rPr>
-          <w:b/>
-          <w:bCs/>
-        </w:rPr>
-      </w:pPr>
-      <w:r>
-        <w:rPr>
-          <w:b/>
-          <w:bCs/>
+        <w:rPr>
+          <w:b/>
+          <w:bCs/>
+        </w:rPr>
+      </w:pPr>
+      <w:r>
+        <w:rPr>
+          <w:b/>
+          <w:bCs/>
+          <w:highlight w:val="yellow"/>
         </w:rPr>
         <w:t>Tokenisation :</w:t>
       </w:r>
     </w:p>
     <w:p>
       <w:pPr>
-        <w:numPr>
-          <w:ilvl w:val="0"/>
-          <w:numId w:val="5"/>
-        </w:numPr>
-      </w:pPr>
+        <w:rPr>
+          <w:b/>
+          <w:bCs/>
+        </w:rPr>
+      </w:pPr>
+      <w:r>
+        <w:rPr>
+          <w:b/>
+          <w:bCs/>
+          <w:highlight w:val="yellow"/>
+        </w:rPr>
+        <w:t xml:space="preserve">Stop </w:t>
+      </w:r>
       <w:proofErr w:type="spellStart"/>
-      <w:proofErr w:type="gramStart"/>
-      <w:r>
-        <w:t>word</w:t>
-      </w:r>
-      <w:proofErr w:type="gramEnd"/>
-      <w:r>
-        <w:t>-based</w:t>
+      <w:r>
+        <w:rPr>
+          <w:b/>
+          <w:bCs/>
+          <w:highlight w:val="yellow"/>
+        </w:rPr>
+        <w:t>words</w:t>
       </w:r>
       <w:proofErr w:type="spellEnd"/>
     </w:p>
     <w:p>
       <w:pPr>
-        <w:numPr>
-          <w:ilvl w:val="0"/>
-          <w:numId w:val="5"/>
-        </w:numPr>
-      </w:pPr>
+        <w:rPr>
+          <w:b/>
+          <w:bCs/>
+        </w:rPr>
+      </w:pPr>
+      <w:r>
+        <w:rPr>
+          <w:b/>
+          <w:bCs/>
+          <w:highlight w:val="yellow"/>
+        </w:rPr>
+        <w:t xml:space="preserve">Lemmatisation &amp; </w:t>
+      </w:r>
       <w:proofErr w:type="spellStart"/>
-      <w:proofErr w:type="gramStart"/>
-      <w:r>
-        <w:t>character</w:t>
-      </w:r>
-      <w:proofErr w:type="gramEnd"/>
-      <w:r>
-        <w:t>-based</w:t>
+      <w:r>
+        <w:rPr>
+          <w:b/>
+          <w:bCs/>
+          <w:highlight w:val="yellow"/>
+        </w:rPr>
+        <w:t>stemming</w:t>
       </w:r>
       <w:proofErr w:type="spellEnd"/>
     </w:p>
     <w:p>
       <w:pPr>
-        <w:numPr>
-          <w:ilvl w:val="0"/>
-          <w:numId w:val="5"/>
-        </w:numPr>
-      </w:pPr>
-      <w:proofErr w:type="spellStart"/>
-      <w:proofErr w:type="gramStart"/>
-      <w:r>
-        <w:t>subword</w:t>
-      </w:r>
-      <w:proofErr w:type="spellEnd"/>
-      <w:proofErr w:type="gramEnd"/>
-      <w:r>
-        <w:t xml:space="preserve"> (BPE, </w:t>
-      </w:r>
-      <w:proofErr w:type="spellStart"/>
-      <w:r>
-        <w:t>WordPiece</w:t>
-      </w:r>
-      <w:proofErr w:type="spellEnd"/>
-      <w:r>
-        <w:t>)</w:t>
-      </w:r>
-    </w:p>
-    <w:p>
-      <w:pPr>
-        <w:rPr>
-          <w:b/>
-          <w:bCs/>
-        </w:rPr>
-      </w:pPr>
-      <w:r>
-        <w:rPr>
-          <w:b/>
-          <w:bCs/>
-        </w:rPr>
-        <w:t xml:space="preserve">Stop </w:t>
-      </w:r>
-      <w:proofErr w:type="spellStart"/>
-      <w:r>
-        <w:rPr>
-          <w:b/>
-          <w:bCs/>
-        </w:rPr>
-        <w:t>words</w:t>
-      </w:r>
-      <w:proofErr w:type="spellEnd"/>
-    </w:p>
-    <w:p>
-      <w:pPr>
-        <w:numPr>
-          <w:ilvl w:val="0"/>
-          <w:numId w:val="6"/>
-        </w:numPr>
-      </w:pPr>
-      <w:proofErr w:type="gramStart"/>
-      <w:r>
-        <w:t>avantages</w:t>
-      </w:r>
-      <w:proofErr w:type="gramEnd"/>
-      <w:r>
-        <w:t xml:space="preserve"> / inconvénients</w:t>
-      </w:r>
-    </w:p>
-    <w:p>
-      <w:pPr>
-        <w:rPr>
-          <w:b/>
-          <w:bCs/>
-        </w:rPr>
-      </w:pPr>
-      <w:r>
-        <w:rPr>
-          <w:b/>
-          <w:bCs/>
-        </w:rPr>
-        <w:t xml:space="preserve">Lemmatisation &amp; </w:t>
-      </w:r>
-      <w:proofErr w:type="spellStart"/>
-      <w:r>
-        <w:rPr>
-          <w:b/>
-          <w:bCs/>
-        </w:rPr>
-        <w:t>stemming</w:t>
-      </w:r>
-      <w:proofErr w:type="spellEnd"/>
-    </w:p>
-    <w:p>
-      <w:pPr>
-        <w:numPr>
-          <w:ilvl w:val="0"/>
-          <w:numId w:val="7"/>
-        </w:numPr>
-      </w:pPr>
-      <w:proofErr w:type="gramStart"/>
-      <w:r>
-        <w:t>différences</w:t>
-      </w:r>
-      <w:proofErr w:type="gramEnd"/>
-    </w:p>
-    <w:p>
-      <w:pPr>
-        <w:numPr>
-          <w:ilvl w:val="0"/>
-          <w:numId w:val="7"/>
-        </w:numPr>
-      </w:pPr>
-      <w:proofErr w:type="gramStart"/>
-      <w:r>
-        <w:lastRenderedPageBreak/>
-        <w:t>algorithmes</w:t>
-      </w:r>
-      <w:proofErr w:type="gramEnd"/>
-      <w:r>
-        <w:t xml:space="preserve"> (Porter, Snowball)</w:t>
-      </w:r>
-    </w:p>
-    <w:p>
-      <w:pPr>
-        <w:rPr>
-          <w:b/>
-          <w:bCs/>
-        </w:rPr>
-      </w:pPr>
-      <w:r>
-        <w:rPr>
-          <w:b/>
-          <w:bCs/>
+        <w:rPr>
+          <w:b/>
+          <w:bCs/>
+          <w:highlight w:val="yellow"/>
+        </w:rPr>
+      </w:pPr>
+      <w:r>
+        <w:rPr>
+          <w:b/>
+          <w:bCs/>
+          <w:highlight w:val="yellow"/>
         </w:rPr>
         <w:t>Gestion des langues</w:t>
       </w:r>
@@ -511,13 +361,22 @@
           <w:ilvl w:val="0"/>
           <w:numId w:val="8"/>
         </w:numPr>
+        <w:rPr>
+          <w:highlight w:val="yellow"/>
+        </w:rPr>
       </w:pPr>
       <w:proofErr w:type="gramStart"/>
       <w:r>
+        <w:rPr>
+          <w:highlight w:val="yellow"/>
+        </w:rPr>
         <w:t>encodage</w:t>
       </w:r>
       <w:proofErr w:type="gramEnd"/>
       <w:r>
+        <w:rPr>
+          <w:highlight w:val="yellow"/>
+        </w:rPr>
         <w:t xml:space="preserve"> (UTF-8)</w:t>
       </w:r>
     </w:p>
@@ -527,142 +386,88 @@
           <w:ilvl w:val="0"/>
           <w:numId w:val="8"/>
         </w:numPr>
+        <w:rPr>
+          <w:highlight w:val="yellow"/>
+        </w:rPr>
       </w:pPr>
       <w:proofErr w:type="gramStart"/>
       <w:r>
+        <w:rPr>
+          <w:highlight w:val="yellow"/>
+        </w:rPr>
         <w:t>accents</w:t>
       </w:r>
       <w:proofErr w:type="gramEnd"/>
     </w:p>
     <w:p>
-      <w:pPr>
-        <w:numPr>
-          <w:ilvl w:val="0"/>
-          <w:numId w:val="8"/>
-        </w:numPr>
-      </w:pPr>
-      <w:proofErr w:type="gramStart"/>
-      <w:r>
-        <w:t>langues</w:t>
-      </w:r>
-      <w:proofErr w:type="gramEnd"/>
-      <w:r>
-        <w:t xml:space="preserve"> riches morphologiquement</w:t>
-      </w:r>
-    </w:p>
-    <w:p>
-      <w:r>
-        <w:rPr>
-          <w:rFonts w:ascii="Segoe UI Symbol" w:hAnsi="Segoe UI Symbol" w:cs="Segoe UI Symbol"/>
-        </w:rPr>
-        <w:t>🛠</w:t>
-      </w:r>
-      <w:r>
-        <w:t xml:space="preserve"> </w:t>
-      </w:r>
-      <w:r>
-        <w:rPr>
-          <w:b/>
-          <w:bCs/>
-        </w:rPr>
-        <w:t>Outils</w:t>
-      </w:r>
-      <w:r>
-        <w:t xml:space="preserve"> :</w:t>
-      </w:r>
-    </w:p>
-    <w:p>
-      <w:pPr>
-        <w:numPr>
-          <w:ilvl w:val="0"/>
-          <w:numId w:val="9"/>
-        </w:numPr>
-      </w:pPr>
-      <w:r>
-        <w:t>NLTK</w:t>
-      </w:r>
-    </w:p>
-    <w:p>
-      <w:pPr>
-        <w:numPr>
-          <w:ilvl w:val="0"/>
-          <w:numId w:val="9"/>
-        </w:numPr>
-      </w:pPr>
+      <w:r>
+        <w:pict w14:anchorId="1A1118ED">
+          <v:rect id="_x0000_i1026" style="width:0;height:1.5pt" o:hralign="center" o:hrstd="t" o:hr="t" fillcolor="#a0a0a0" stroked="f"/>
+        </w:pict>
+      </w:r>
+    </w:p>
+    <w:p>
+      <w:pPr>
+        <w:rPr>
+          <w:b/>
+          <w:bCs/>
+        </w:rPr>
+      </w:pPr>
+      <w:r>
+        <w:rPr>
+          <w:rFonts w:ascii="Segoe UI Emoji" w:hAnsi="Segoe UI Emoji" w:cs="Segoe UI Emoji"/>
+          <w:b/>
+          <w:bCs/>
+        </w:rPr>
+        <w:t>🟢</w:t>
+      </w:r>
+      <w:r>
+        <w:rPr>
+          <w:b/>
+          <w:bCs/>
+        </w:rPr>
+        <w:t xml:space="preserve"> PHASE 3 — Représentation du texte (NLP classique)</w:t>
+      </w:r>
+    </w:p>
+    <w:p>
+      <w:r>
+        <w:rPr>
+          <w:b/>
+          <w:bCs/>
+        </w:rPr>
+        <w:t>Transformer le texte en nombres</w:t>
+      </w:r>
+    </w:p>
+    <w:p>
+      <w:pPr>
+        <w:rPr>
+          <w:b/>
+          <w:bCs/>
+        </w:rPr>
+      </w:pPr>
+      <w:r>
+        <w:rPr>
+          <w:b/>
+          <w:bCs/>
+          <w:highlight w:val="yellow"/>
+        </w:rPr>
+        <w:t>Bag of Words (</w:t>
+      </w:r>
       <w:proofErr w:type="spellStart"/>
-      <w:proofErr w:type="gramStart"/>
-      <w:r>
-        <w:t>spaCy</w:t>
+      <w:r>
+        <w:rPr>
+          <w:b/>
+          <w:bCs/>
+          <w:highlight w:val="yellow"/>
+        </w:rPr>
+        <w:t>BoW</w:t>
       </w:r>
       <w:proofErr w:type="spellEnd"/>
-      <w:proofErr w:type="gramEnd"/>
-    </w:p>
-    <w:p>
-      <w:r>
-        <w:pict w14:anchorId="1A1118ED">
-          <v:rect id="_x0000_i1027" style="width:0;height:1.5pt" o:hralign="center" o:hrstd="t" o:hr="t" fillcolor="#a0a0a0" stroked="f"/>
-        </w:pict>
-      </w:r>
-    </w:p>
-    <w:p>
-      <w:pPr>
-        <w:rPr>
-          <w:b/>
-          <w:bCs/>
-        </w:rPr>
-      </w:pPr>
-      <w:r>
-        <w:rPr>
-          <w:rFonts w:ascii="Segoe UI Emoji" w:hAnsi="Segoe UI Emoji" w:cs="Segoe UI Emoji"/>
-          <w:b/>
-          <w:bCs/>
-        </w:rPr>
-        <w:t>🟢</w:t>
-      </w:r>
-      <w:r>
-        <w:rPr>
-          <w:b/>
-          <w:bCs/>
-        </w:rPr>
-        <w:t xml:space="preserve"> PHASE 3 — Représentation du texte (NLP classique)</w:t>
-      </w:r>
-    </w:p>
-    <w:p>
-      <w:r>
-        <w:rPr>
-          <w:b/>
-          <w:bCs/>
-        </w:rPr>
-        <w:t>Transformer le texte en nombres</w:t>
-      </w:r>
-    </w:p>
-    <w:p>
-      <w:pPr>
-        <w:rPr>
-          <w:b/>
-          <w:bCs/>
-        </w:rPr>
-      </w:pPr>
-      <w:r>
-        <w:rPr>
-          <w:b/>
-          <w:bCs/>
-        </w:rPr>
-        <w:t>Bag of Words (</w:t>
-      </w:r>
-      <w:proofErr w:type="spellStart"/>
-      <w:r>
-        <w:rPr>
-          <w:b/>
-          <w:bCs/>
-        </w:rPr>
-        <w:t>BoW</w:t>
-      </w:r>
-      <w:proofErr w:type="spellEnd"/>
-      <w:r>
-        <w:rPr>
-          <w:b/>
-          <w:bCs/>
+      <w:r>
+        <w:rPr>
+          <w:b/>
+          <w:bCs/>
+          <w:highlight w:val="yellow"/>
         </w:rPr>
         <w:t>)</w:t>
       </w:r>
@@ -673,23 +478,38 @@
           <w:ilvl w:val="0"/>
           <w:numId w:val="10"/>
         </w:numPr>
+        <w:rPr>
+          <w:highlight w:val="yellow"/>
+        </w:rPr>
       </w:pPr>
       <w:proofErr w:type="spellStart"/>
       <w:proofErr w:type="gramStart"/>
       <w:r>
+        <w:rPr>
+          <w:highlight w:val="yellow"/>
+        </w:rPr>
         <w:t>unigram</w:t>
       </w:r>
       <w:proofErr w:type="spellEnd"/>
       <w:proofErr w:type="gramEnd"/>
       <w:r>
+        <w:rPr>
+          <w:highlight w:val="yellow"/>
+        </w:rPr>
         <w:t xml:space="preserve">, </w:t>
       </w:r>
       <w:proofErr w:type="spellStart"/>
       <w:r>
+        <w:rPr>
+          <w:highlight w:val="yellow"/>
+        </w:rPr>
         <w:t>bigram</w:t>
       </w:r>
       <w:proofErr w:type="spellEnd"/>
       <w:r>
+        <w:rPr>
+          <w:highlight w:val="yellow"/>
+        </w:rPr>
         <w:t>, n-gram</w:t>
       </w:r>
     </w:p>
@@ -699,9 +519,15 @@
           <w:ilvl w:val="0"/>
           <w:numId w:val="10"/>
         </w:numPr>
+        <w:rPr>
+          <w:highlight w:val="yellow"/>
+        </w:rPr>
       </w:pPr>
       <w:proofErr w:type="gramStart"/>
       <w:r>
+        <w:rPr>
+          <w:highlight w:val="yellow"/>
+        </w:rPr>
         <w:t>limitations</w:t>
       </w:r>
       <w:proofErr w:type="gramEnd"/>
@@ -711,12 +537,14 @@
         <w:rPr>
           <w:b/>
           <w:bCs/>
-        </w:rPr>
-      </w:pPr>
-      <w:r>
-        <w:rPr>
-          <w:b/>
-          <w:bCs/>
+          <w:highlight w:val="yellow"/>
+        </w:rPr>
+      </w:pPr>
+      <w:r>
+        <w:rPr>
+          <w:b/>
+          <w:bCs/>
+          <w:highlight w:val="yellow"/>
         </w:rPr>
         <w:t>TF-IDF</w:t>
       </w:r>
@@ -727,30 +555,23 @@
           <w:ilvl w:val="0"/>
           <w:numId w:val="11"/>
         </w:numPr>
+        <w:rPr>
+          <w:highlight w:val="yellow"/>
+        </w:rPr>
       </w:pPr>
       <w:proofErr w:type="gramStart"/>
       <w:r>
+        <w:rPr>
+          <w:highlight w:val="yellow"/>
+        </w:rPr>
         <w:t>intuition</w:t>
       </w:r>
       <w:proofErr w:type="gramEnd"/>
       <w:r>
+        <w:rPr>
+          <w:highlight w:val="yellow"/>
+        </w:rPr>
         <w:t xml:space="preserve"> mathématique</w:t>
-      </w:r>
-    </w:p>
-    <w:p>
-      <w:pPr>
-        <w:numPr>
-          <w:ilvl w:val="0"/>
-          <w:numId w:val="11"/>
-        </w:numPr>
-      </w:pPr>
-      <w:proofErr w:type="gramStart"/>
-      <w:r>
-        <w:t>avantages</w:t>
-      </w:r>
-      <w:proofErr w:type="gramEnd"/>
-      <w:r>
-        <w:t xml:space="preserve"> / inconvénients</w:t>
       </w:r>
     </w:p>
     <w:p>
@@ -835,6 +656,7 @@
       </w:pPr>
       <w:proofErr w:type="gramStart"/>
       <w:r>
+        <w:lastRenderedPageBreak/>
         <w:t>fréquence</w:t>
       </w:r>
       <w:proofErr w:type="gramEnd"/>
@@ -855,47 +677,8 @@
     </w:p>
     <w:p>
       <w:r>
-        <w:rPr>
-          <w:rFonts w:ascii="Segoe UI Symbol" w:hAnsi="Segoe UI Symbol" w:cs="Segoe UI Symbol"/>
-        </w:rPr>
-        <w:t>🛠</w:t>
-      </w:r>
-      <w:r>
-        <w:t xml:space="preserve"> </w:t>
-      </w:r>
-      <w:r>
-        <w:rPr>
-          <w:b/>
-          <w:bCs/>
-        </w:rPr>
-        <w:t>Librairies</w:t>
-      </w:r>
-      <w:r>
-        <w:t xml:space="preserve"> :</w:t>
-      </w:r>
-    </w:p>
-    <w:p>
-      <w:pPr>
-        <w:numPr>
-          <w:ilvl w:val="0"/>
-          <w:numId w:val="13"/>
-        </w:numPr>
-      </w:pPr>
-      <w:proofErr w:type="spellStart"/>
-      <w:proofErr w:type="gramStart"/>
-      <w:r>
-        <w:t>scikit</w:t>
-      </w:r>
-      <w:proofErr w:type="spellEnd"/>
-      <w:proofErr w:type="gramEnd"/>
-      <w:r>
-        <w:t>-learn</w:t>
-      </w:r>
-    </w:p>
-    <w:p>
-      <w:r>
         <w:pict w14:anchorId="1CF60C93">
-          <v:rect id="_x0000_i1028" style="width:0;height:1.5pt" o:hralign="center" o:hrstd="t" o:hr="t" fillcolor="#a0a0a0" stroked="f"/>
+          <v:rect id="_x0000_i1027" style="width:0;height:1.5pt" o:hralign="center" o:hrstd="t" o:hr="t" fillcolor="#a0a0a0" stroked="f"/>
         </w:pict>
       </w:r>
     </w:p>
@@ -1193,7 +976,7 @@
     <w:p>
       <w:r>
         <w:pict w14:anchorId="264D1A07">
-          <v:rect id="_x0000_i1029" style="width:0;height:1.5pt" o:hralign="center" o:hrstd="t" o:hr="t" fillcolor="#a0a0a0" stroked="f"/>
+          <v:rect id="_x0000_i1028" style="width:0;height:1.5pt" o:hralign="center" o:hrstd="t" o:hr="t" fillcolor="#a0a0a0" stroked="f"/>
         </w:pict>
       </w:r>
     </w:p>
@@ -1463,7 +1246,7 @@
     <w:p>
       <w:r>
         <w:pict w14:anchorId="76EC41FA">
-          <v:rect id="_x0000_i1030" style="width:0;height:1.5pt" o:hralign="center" o:hrstd="t" o:hr="t" fillcolor="#a0a0a0" stroked="f"/>
+          <v:rect id="_x0000_i1029" style="width:0;height:1.5pt" o:hralign="center" o:hrstd="t" o:hr="t" fillcolor="#a0a0a0" stroked="f"/>
         </w:pict>
       </w:r>
     </w:p>
@@ -1752,7 +1535,7 @@
     <w:p>
       <w:r>
         <w:pict w14:anchorId="60ABFFF1">
-          <v:rect id="_x0000_i1031" style="width:0;height:1.5pt" o:hralign="center" o:hrstd="t" o:hr="t" fillcolor="#a0a0a0" stroked="f"/>
+          <v:rect id="_x0000_i1030" style="width:0;height:1.5pt" o:hralign="center" o:hrstd="t" o:hr="t" fillcolor="#a0a0a0" stroked="f"/>
         </w:pict>
       </w:r>
     </w:p>
@@ -2051,7 +1834,7 @@
     <w:p>
       <w:r>
         <w:pict w14:anchorId="41869E96">
-          <v:rect id="_x0000_i1032" style="width:0;height:1.5pt" o:hralign="center" o:hrstd="t" o:hr="t" fillcolor="#a0a0a0" stroked="f"/>
+          <v:rect id="_x0000_i1031" style="width:0;height:1.5pt" o:hralign="center" o:hrstd="t" o:hr="t" fillcolor="#a0a0a0" stroked="f"/>
         </w:pict>
       </w:r>
     </w:p>
@@ -2238,7 +2021,7 @@
     <w:p>
       <w:r>
         <w:pict w14:anchorId="647EB8C1">
-          <v:rect id="_x0000_i1033" style="width:0;height:1.5pt" o:hralign="center" o:hrstd="t" o:hr="t" fillcolor="#a0a0a0" stroked="f"/>
+          <v:rect id="_x0000_i1032" style="width:0;height:1.5pt" o:hralign="center" o:hrstd="t" o:hr="t" fillcolor="#a0a0a0" stroked="f"/>
         </w:pict>
       </w:r>
     </w:p>
@@ -2531,7 +2314,7 @@
     <w:p>
       <w:r>
         <w:pict w14:anchorId="6C82C344">
-          <v:rect id="_x0000_i1034" style="width:0;height:1.5pt" o:hralign="center" o:hrstd="t" o:hr="t" fillcolor="#a0a0a0" stroked="f"/>
+          <v:rect id="_x0000_i1033" style="width:0;height:1.5pt" o:hralign="center" o:hrstd="t" o:hr="t" fillcolor="#a0a0a0" stroked="f"/>
         </w:pict>
       </w:r>
     </w:p>
@@ -2742,7 +2525,7 @@
     <w:p>
       <w:r>
         <w:pict w14:anchorId="6F89EAE8">
-          <v:rect id="_x0000_i1035" style="width:0;height:1.5pt" o:hralign="center" o:hrstd="t" o:hr="t" fillcolor="#a0a0a0" stroked="f"/>
+          <v:rect id="_x0000_i1034" style="width:0;height:1.5pt" o:hralign="center" o:hrstd="t" o:hr="t" fillcolor="#a0a0a0" stroked="f"/>
         </w:pict>
       </w:r>
     </w:p>

</xml_diff>

<commit_message>
Day 6: Exercice général correction des parties A B C
</commit_message>
<xml_diff>
--- a/plan d'apprentissage.docx
+++ b/plan d'apprentissage.docx
@@ -586,6 +586,7 @@
         <w:rPr>
           <w:b/>
           <w:bCs/>
+          <w:highlight w:val="yellow"/>
         </w:rPr>
         <w:t>One-hot</w:t>
       </w:r>
@@ -594,6 +595,7 @@
         <w:rPr>
           <w:b/>
           <w:bCs/>
+          <w:highlight w:val="yellow"/>
         </w:rPr>
         <w:t xml:space="preserve"> </w:t>
       </w:r>
@@ -602,6 +604,7 @@
         <w:rPr>
           <w:b/>
           <w:bCs/>
+          <w:highlight w:val="yellow"/>
         </w:rPr>
         <w:t>encoding</w:t>
       </w:r>
@@ -612,6 +615,7 @@
         <w:rPr>
           <w:b/>
           <w:bCs/>
+          <w:highlight w:val="yellow"/>
         </w:rPr>
       </w:pPr>
       <w:proofErr w:type="spellStart"/>
@@ -619,6 +623,7 @@
         <w:rPr>
           <w:b/>
           <w:bCs/>
+          <w:highlight w:val="yellow"/>
         </w:rPr>
         <w:t>Feature</w:t>
       </w:r>
@@ -627,6 +632,7 @@
         <w:rPr>
           <w:b/>
           <w:bCs/>
+          <w:highlight w:val="yellow"/>
         </w:rPr>
         <w:t xml:space="preserve"> engineering NLP</w:t>
       </w:r>
@@ -637,14 +643,57 @@
           <w:ilvl w:val="0"/>
           <w:numId w:val="12"/>
         </w:numPr>
+        <w:rPr>
+          <w:highlight w:val="yellow"/>
+        </w:rPr>
       </w:pPr>
       <w:proofErr w:type="gramStart"/>
       <w:r>
+        <w:rPr>
+          <w:highlight w:val="yellow"/>
+        </w:rPr>
         <w:t>longueur</w:t>
       </w:r>
       <w:proofErr w:type="gramEnd"/>
       <w:r>
+        <w:rPr>
+          <w:highlight w:val="yellow"/>
+        </w:rPr>
         <w:t xml:space="preserve"> phrase</w:t>
+      </w:r>
+      <w:r>
+        <w:rPr>
+          <w:highlight w:val="yellow"/>
+        </w:rPr>
+        <w:t xml:space="preserve"> </w:t>
+      </w:r>
+      <w:proofErr w:type="spellStart"/>
+      <w:r>
+        <w:rPr>
+          <w:highlight w:val="yellow"/>
+        </w:rPr>
+        <w:t>len</w:t>
+      </w:r>
+      <w:proofErr w:type="spellEnd"/>
+      <w:r>
+        <w:rPr>
+          <w:highlight w:val="yellow"/>
+        </w:rPr>
+        <w:t>(</w:t>
+      </w:r>
+      <w:proofErr w:type="spellStart"/>
+      <w:r>
+        <w:rPr>
+          <w:highlight w:val="yellow"/>
+        </w:rPr>
+        <w:t>tokens</w:t>
+      </w:r>
+      <w:proofErr w:type="spellEnd"/>
+      <w:r>
+        <w:rPr>
+          <w:highlight w:val="yellow"/>
+        </w:rPr>
+        <w:t>)</w:t>
       </w:r>
     </w:p>
     <w:p>
@@ -653,15 +702,44 @@
           <w:ilvl w:val="0"/>
           <w:numId w:val="12"/>
         </w:numPr>
+        <w:rPr>
+          <w:highlight w:val="yellow"/>
+        </w:rPr>
       </w:pPr>
       <w:proofErr w:type="gramStart"/>
       <w:r>
+        <w:rPr>
+          <w:highlight w:val="yellow"/>
+        </w:rPr>
         <w:lastRenderedPageBreak/>
         <w:t>fréquence</w:t>
       </w:r>
       <w:proofErr w:type="gramEnd"/>
       <w:r>
+        <w:rPr>
+          <w:highlight w:val="yellow"/>
+        </w:rPr>
         <w:t xml:space="preserve"> mots</w:t>
+      </w:r>
+      <w:r>
+        <w:rPr>
+          <w:highlight w:val="yellow"/>
+        </w:rPr>
+        <w:t xml:space="preserve">   Counter(</w:t>
+      </w:r>
+      <w:proofErr w:type="spellStart"/>
+      <w:r>
+        <w:rPr>
+          <w:highlight w:val="yellow"/>
+        </w:rPr>
+        <w:t>words</w:t>
+      </w:r>
+      <w:proofErr w:type="spellEnd"/>
+      <w:r>
+        <w:rPr>
+          <w:highlight w:val="yellow"/>
+        </w:rPr>
+        <w:t>)</w:t>
       </w:r>
     </w:p>
     <w:p>
@@ -670,8 +748,14 @@
           <w:ilvl w:val="0"/>
           <w:numId w:val="12"/>
         </w:numPr>
-      </w:pPr>
-      <w:r>
+        <w:rPr>
+          <w:highlight w:val="yellow"/>
+        </w:rPr>
+      </w:pPr>
+      <w:r>
+        <w:rPr>
+          <w:highlight w:val="yellow"/>
+        </w:rPr>
         <w:t>POS tags</w:t>
       </w:r>
     </w:p>

</xml_diff>

<commit_message>
Day 7: Exercice général correction des parties D E F G H I
</commit_message>
<xml_diff>
--- a/plan d'apprentissage.docx
+++ b/plan d'apprentissage.docx
@@ -757,6 +757,23 @@
           <w:highlight w:val="yellow"/>
         </w:rPr>
         <w:t>POS tags</w:t>
+      </w:r>
+    </w:p>
+    <w:p>
+      <w:pPr>
+        <w:rPr>
+          <w:sz w:val="44"/>
+          <w:szCs w:val="44"/>
+          <w:highlight w:val="yellow"/>
+        </w:rPr>
+      </w:pPr>
+      <w:r>
+        <w:rPr>
+          <w:sz w:val="44"/>
+          <w:szCs w:val="44"/>
+          <w:highlight w:val="yellow"/>
+        </w:rPr>
+        <w:t>EXERCICE GENERAL</w:t>
       </w:r>
     </w:p>
     <w:p>

</xml_diff>

<commit_message>
bonus regex expressions in python
</commit_message>
<xml_diff>
--- a/plan d'apprentissage.docx
+++ b/plan d'apprentissage.docx
@@ -795,6 +795,7 @@
           <w:rFonts w:ascii="Segoe UI Emoji" w:hAnsi="Segoe UI Emoji" w:cs="Segoe UI Emoji"/>
           <w:b/>
           <w:bCs/>
+          <w:highlight w:val="yellow"/>
         </w:rPr>
         <w:t>🟢</w:t>
       </w:r>
@@ -802,275 +803,98 @@
         <w:rPr>
           <w:b/>
           <w:bCs/>
+          <w:highlight w:val="yellow"/>
         </w:rPr>
         <w:t xml:space="preserve"> PHASE 4 — NLP classique + ML</w:t>
       </w:r>
     </w:p>
     <w:p>
-      <w:r>
-        <w:rPr>
-          <w:b/>
-          <w:bCs/>
-        </w:rPr>
-        <w:t xml:space="preserve">Avant le </w:t>
+      <w:pPr>
+        <w:ind w:left="360"/>
+        <w:rPr>
+          <w:color w:val="EE0000"/>
+          <w:sz w:val="36"/>
+          <w:szCs w:val="36"/>
+        </w:rPr>
+      </w:pPr>
+      <w:r>
+        <w:rPr>
+          <w:color w:val="EE0000"/>
+          <w:sz w:val="36"/>
+          <w:szCs w:val="36"/>
+        </w:rPr>
+        <w:t>Sentiment</w:t>
+      </w:r>
+      <w:r>
+        <w:rPr>
+          <w:color w:val="EE0000"/>
+          <w:sz w:val="36"/>
+          <w:szCs w:val="36"/>
+        </w:rPr>
+        <w:t xml:space="preserve"> </w:t>
       </w:r>
       <w:proofErr w:type="spellStart"/>
       <w:r>
         <w:rPr>
-          <w:b/>
-          <w:bCs/>
-        </w:rPr>
-        <w:t>deep</w:t>
+          <w:color w:val="EE0000"/>
+          <w:sz w:val="36"/>
+          <w:szCs w:val="36"/>
+        </w:rPr>
+        <w:t>analysis</w:t>
       </w:r>
       <w:proofErr w:type="spellEnd"/>
       <w:r>
         <w:rPr>
-          <w:b/>
-          <w:bCs/>
+          <w:color w:val="EE0000"/>
+          <w:sz w:val="36"/>
+          <w:szCs w:val="36"/>
         </w:rPr>
         <w:t xml:space="preserve"> </w:t>
       </w:r>
       <w:proofErr w:type="spellStart"/>
       <w:r>
         <w:rPr>
-          <w:b/>
-          <w:bCs/>
-        </w:rPr>
-        <w:t>learning</w:t>
+          <w:color w:val="EE0000"/>
+          <w:sz w:val="36"/>
+          <w:szCs w:val="36"/>
+        </w:rPr>
+        <w:t>using</w:t>
       </w:r>
       <w:proofErr w:type="spellEnd"/>
-    </w:p>
-    <w:p>
-      <w:pPr>
-        <w:rPr>
-          <w:b/>
-          <w:bCs/>
-        </w:rPr>
-      </w:pPr>
-      <w:r>
-        <w:rPr>
-          <w:b/>
-          <w:bCs/>
-        </w:rPr>
-        <w:t>Algorithmes :</w:t>
-      </w:r>
-    </w:p>
-    <w:p>
-      <w:pPr>
-        <w:numPr>
-          <w:ilvl w:val="0"/>
-          <w:numId w:val="14"/>
-        </w:numPr>
-      </w:pPr>
+      <w:r>
+        <w:rPr>
+          <w:color w:val="EE0000"/>
+          <w:sz w:val="36"/>
+          <w:szCs w:val="36"/>
+        </w:rPr>
+        <w:t xml:space="preserve"> </w:t>
+      </w:r>
       <w:proofErr w:type="spellStart"/>
       <w:r>
-        <w:t>Naive</w:t>
+        <w:rPr>
+          <w:color w:val="EE0000"/>
+          <w:sz w:val="36"/>
+          <w:szCs w:val="36"/>
+        </w:rPr>
+        <w:t>Logistic</w:t>
       </w:r>
       <w:proofErr w:type="spellEnd"/>
       <w:r>
-        <w:t xml:space="preserve"> Bayes</w:t>
-      </w:r>
-    </w:p>
-    <w:p>
-      <w:pPr>
-        <w:numPr>
-          <w:ilvl w:val="0"/>
-          <w:numId w:val="14"/>
-        </w:numPr>
-      </w:pPr>
+        <w:rPr>
+          <w:color w:val="EE0000"/>
+          <w:sz w:val="36"/>
+          <w:szCs w:val="36"/>
+        </w:rPr>
+        <w:t xml:space="preserve"> </w:t>
+      </w:r>
       <w:proofErr w:type="spellStart"/>
       <w:r>
-        <w:t>Logistic</w:t>
-      </w:r>
-      <w:proofErr w:type="spellEnd"/>
-      <w:r>
-        <w:t xml:space="preserve"> </w:t>
-      </w:r>
-      <w:proofErr w:type="spellStart"/>
-      <w:r>
+        <w:rPr>
+          <w:color w:val="EE0000"/>
+          <w:sz w:val="36"/>
+          <w:szCs w:val="36"/>
+        </w:rPr>
         <w:t>Regression</w:t>
-      </w:r>
-      <w:proofErr w:type="spellEnd"/>
-    </w:p>
-    <w:p>
-      <w:pPr>
-        <w:numPr>
-          <w:ilvl w:val="0"/>
-          <w:numId w:val="14"/>
-        </w:numPr>
-      </w:pPr>
-      <w:r>
-        <w:t>SVM</w:t>
-      </w:r>
-    </w:p>
-    <w:p>
-      <w:pPr>
-        <w:numPr>
-          <w:ilvl w:val="0"/>
-          <w:numId w:val="14"/>
-        </w:numPr>
-      </w:pPr>
-      <w:r>
-        <w:t>Random Forest</w:t>
-      </w:r>
-    </w:p>
-    <w:p>
-      <w:pPr>
-        <w:rPr>
-          <w:b/>
-          <w:bCs/>
-        </w:rPr>
-      </w:pPr>
-      <w:r>
-        <w:rPr>
-          <w:b/>
-          <w:bCs/>
-        </w:rPr>
-        <w:t>Tâches :</w:t>
-      </w:r>
-    </w:p>
-    <w:p>
-      <w:pPr>
-        <w:numPr>
-          <w:ilvl w:val="0"/>
-          <w:numId w:val="15"/>
-        </w:numPr>
-      </w:pPr>
-      <w:proofErr w:type="gramStart"/>
-      <w:r>
-        <w:t>classification</w:t>
-      </w:r>
-      <w:proofErr w:type="gramEnd"/>
-      <w:r>
-        <w:t xml:space="preserve"> de texte</w:t>
-      </w:r>
-    </w:p>
-    <w:p>
-      <w:pPr>
-        <w:numPr>
-          <w:ilvl w:val="0"/>
-          <w:numId w:val="15"/>
-        </w:numPr>
-      </w:pPr>
-      <w:proofErr w:type="gramStart"/>
-      <w:r>
-        <w:t>spam</w:t>
-      </w:r>
-      <w:proofErr w:type="gramEnd"/>
-      <w:r>
-        <w:t xml:space="preserve"> </w:t>
-      </w:r>
-      <w:proofErr w:type="spellStart"/>
-      <w:r>
-        <w:t>detection</w:t>
-      </w:r>
-      <w:proofErr w:type="spellEnd"/>
-    </w:p>
-    <w:p>
-      <w:pPr>
-        <w:numPr>
-          <w:ilvl w:val="0"/>
-          <w:numId w:val="15"/>
-        </w:numPr>
-      </w:pPr>
-      <w:proofErr w:type="gramStart"/>
-      <w:r>
-        <w:t>sentiment</w:t>
-      </w:r>
-      <w:proofErr w:type="gramEnd"/>
-      <w:r>
-        <w:t xml:space="preserve"> </w:t>
-      </w:r>
-      <w:proofErr w:type="spellStart"/>
-      <w:r>
-        <w:t>analysis</w:t>
-      </w:r>
-      <w:proofErr w:type="spellEnd"/>
-    </w:p>
-    <w:p>
-      <w:pPr>
-        <w:numPr>
-          <w:ilvl w:val="0"/>
-          <w:numId w:val="15"/>
-        </w:numPr>
-      </w:pPr>
-      <w:proofErr w:type="gramStart"/>
-      <w:r>
-        <w:t>topic</w:t>
-      </w:r>
-      <w:proofErr w:type="gramEnd"/>
-      <w:r>
-        <w:t xml:space="preserve"> classification</w:t>
-      </w:r>
-    </w:p>
-    <w:p>
-      <w:pPr>
-        <w:rPr>
-          <w:b/>
-          <w:bCs/>
-        </w:rPr>
-      </w:pPr>
-      <w:r>
-        <w:rPr>
-          <w:b/>
-          <w:bCs/>
-        </w:rPr>
-        <w:t>Évaluation NLP :</w:t>
-      </w:r>
-    </w:p>
-    <w:p>
-      <w:pPr>
-        <w:numPr>
-          <w:ilvl w:val="0"/>
-          <w:numId w:val="16"/>
-        </w:numPr>
-      </w:pPr>
-      <w:proofErr w:type="gramStart"/>
-      <w:r>
-        <w:t>confusion</w:t>
-      </w:r>
-      <w:proofErr w:type="gramEnd"/>
-      <w:r>
-        <w:t xml:space="preserve"> matrix</w:t>
-      </w:r>
-    </w:p>
-    <w:p>
-      <w:pPr>
-        <w:numPr>
-          <w:ilvl w:val="0"/>
-          <w:numId w:val="16"/>
-        </w:numPr>
-      </w:pPr>
-      <w:r>
-        <w:t>ROC</w:t>
-      </w:r>
-    </w:p>
-    <w:p>
-      <w:pPr>
-        <w:numPr>
-          <w:ilvl w:val="0"/>
-          <w:numId w:val="16"/>
-        </w:numPr>
-      </w:pPr>
-      <w:proofErr w:type="spellStart"/>
-      <w:r>
-        <w:t>Precision</w:t>
-      </w:r>
-      <w:proofErr w:type="spellEnd"/>
-      <w:r>
-        <w:t>/</w:t>
-      </w:r>
-      <w:proofErr w:type="spellStart"/>
-      <w:r>
-        <w:t>Recall</w:t>
-      </w:r>
-      <w:proofErr w:type="spellEnd"/>
-      <w:r>
-        <w:t xml:space="preserve"> </w:t>
-      </w:r>
-      <w:proofErr w:type="spellStart"/>
-      <w:r>
-        <w:t>tradeoff</w:t>
       </w:r>
       <w:proofErr w:type="spellEnd"/>
     </w:p>
@@ -7055,6 +6879,119 @@
     </w:lvl>
   </w:abstractNum>
   <w:abstractNum w:abstractNumId="29" w15:restartNumberingAfterBreak="0">
+    <w:nsid w:val="62AF164A"/>
+    <w:multiLevelType w:val="hybridMultilevel"/>
+    <w:tmpl w:val="78722128"/>
+    <w:lvl w:ilvl="0" w:tplc="040C0001">
+      <w:start w:val="1"/>
+      <w:numFmt w:val="bullet"/>
+      <w:lvlText w:val=""/>
+      <w:lvlJc w:val="left"/>
+      <w:pPr>
+        <w:ind w:left="1080" w:hanging="360"/>
+      </w:pPr>
+      <w:rPr>
+        <w:rFonts w:ascii="Symbol" w:hAnsi="Symbol" w:hint="default"/>
+      </w:rPr>
+    </w:lvl>
+    <w:lvl w:ilvl="1" w:tplc="040C0003" w:tentative="1">
+      <w:start w:val="1"/>
+      <w:numFmt w:val="bullet"/>
+      <w:lvlText w:val="o"/>
+      <w:lvlJc w:val="left"/>
+      <w:pPr>
+        <w:ind w:left="1800" w:hanging="360"/>
+      </w:pPr>
+      <w:rPr>
+        <w:rFonts w:ascii="Courier New" w:hAnsi="Courier New" w:cs="Courier New" w:hint="default"/>
+      </w:rPr>
+    </w:lvl>
+    <w:lvl w:ilvl="2" w:tplc="040C0005" w:tentative="1">
+      <w:start w:val="1"/>
+      <w:numFmt w:val="bullet"/>
+      <w:lvlText w:val=""/>
+      <w:lvlJc w:val="left"/>
+      <w:pPr>
+        <w:ind w:left="2520" w:hanging="360"/>
+      </w:pPr>
+      <w:rPr>
+        <w:rFonts w:ascii="Wingdings" w:hAnsi="Wingdings" w:hint="default"/>
+      </w:rPr>
+    </w:lvl>
+    <w:lvl w:ilvl="3" w:tplc="040C0001" w:tentative="1">
+      <w:start w:val="1"/>
+      <w:numFmt w:val="bullet"/>
+      <w:lvlText w:val=""/>
+      <w:lvlJc w:val="left"/>
+      <w:pPr>
+        <w:ind w:left="3240" w:hanging="360"/>
+      </w:pPr>
+      <w:rPr>
+        <w:rFonts w:ascii="Symbol" w:hAnsi="Symbol" w:hint="default"/>
+      </w:rPr>
+    </w:lvl>
+    <w:lvl w:ilvl="4" w:tplc="040C0003" w:tentative="1">
+      <w:start w:val="1"/>
+      <w:numFmt w:val="bullet"/>
+      <w:lvlText w:val="o"/>
+      <w:lvlJc w:val="left"/>
+      <w:pPr>
+        <w:ind w:left="3960" w:hanging="360"/>
+      </w:pPr>
+      <w:rPr>
+        <w:rFonts w:ascii="Courier New" w:hAnsi="Courier New" w:cs="Courier New" w:hint="default"/>
+      </w:rPr>
+    </w:lvl>
+    <w:lvl w:ilvl="5" w:tplc="040C0005" w:tentative="1">
+      <w:start w:val="1"/>
+      <w:numFmt w:val="bullet"/>
+      <w:lvlText w:val=""/>
+      <w:lvlJc w:val="left"/>
+      <w:pPr>
+        <w:ind w:left="4680" w:hanging="360"/>
+      </w:pPr>
+      <w:rPr>
+        <w:rFonts w:ascii="Wingdings" w:hAnsi="Wingdings" w:hint="default"/>
+      </w:rPr>
+    </w:lvl>
+    <w:lvl w:ilvl="6" w:tplc="040C0001" w:tentative="1">
+      <w:start w:val="1"/>
+      <w:numFmt w:val="bullet"/>
+      <w:lvlText w:val=""/>
+      <w:lvlJc w:val="left"/>
+      <w:pPr>
+        <w:ind w:left="5400" w:hanging="360"/>
+      </w:pPr>
+      <w:rPr>
+        <w:rFonts w:ascii="Symbol" w:hAnsi="Symbol" w:hint="default"/>
+      </w:rPr>
+    </w:lvl>
+    <w:lvl w:ilvl="7" w:tplc="040C0003" w:tentative="1">
+      <w:start w:val="1"/>
+      <w:numFmt w:val="bullet"/>
+      <w:lvlText w:val="o"/>
+      <w:lvlJc w:val="left"/>
+      <w:pPr>
+        <w:ind w:left="6120" w:hanging="360"/>
+      </w:pPr>
+      <w:rPr>
+        <w:rFonts w:ascii="Courier New" w:hAnsi="Courier New" w:cs="Courier New" w:hint="default"/>
+      </w:rPr>
+    </w:lvl>
+    <w:lvl w:ilvl="8" w:tplc="040C0005" w:tentative="1">
+      <w:start w:val="1"/>
+      <w:numFmt w:val="bullet"/>
+      <w:lvlText w:val=""/>
+      <w:lvlJc w:val="left"/>
+      <w:pPr>
+        <w:ind w:left="6840" w:hanging="360"/>
+      </w:pPr>
+      <w:rPr>
+        <w:rFonts w:ascii="Wingdings" w:hAnsi="Wingdings" w:hint="default"/>
+      </w:rPr>
+    </w:lvl>
+  </w:abstractNum>
+  <w:abstractNum w:abstractNumId="30" w15:restartNumberingAfterBreak="0">
     <w:nsid w:val="671F4F6A"/>
     <w:multiLevelType w:val="multilevel"/>
     <w:tmpl w:val="B720CBB0"/>
@@ -7203,7 +7140,7 @@
       </w:rPr>
     </w:lvl>
   </w:abstractNum>
-  <w:abstractNum w:abstractNumId="30" w15:restartNumberingAfterBreak="0">
+  <w:abstractNum w:abstractNumId="31" w15:restartNumberingAfterBreak="0">
     <w:nsid w:val="67C0765E"/>
     <w:multiLevelType w:val="multilevel"/>
     <w:tmpl w:val="8DBA8D00"/>
@@ -7352,7 +7289,7 @@
       </w:rPr>
     </w:lvl>
   </w:abstractNum>
-  <w:abstractNum w:abstractNumId="31" w15:restartNumberingAfterBreak="0">
+  <w:abstractNum w:abstractNumId="32" w15:restartNumberingAfterBreak="0">
     <w:nsid w:val="6870703A"/>
     <w:multiLevelType w:val="multilevel"/>
     <w:tmpl w:val="44060C4A"/>
@@ -7501,7 +7438,7 @@
       </w:rPr>
     </w:lvl>
   </w:abstractNum>
-  <w:abstractNum w:abstractNumId="32" w15:restartNumberingAfterBreak="0">
+  <w:abstractNum w:abstractNumId="33" w15:restartNumberingAfterBreak="0">
     <w:nsid w:val="6C77707F"/>
     <w:multiLevelType w:val="multilevel"/>
     <w:tmpl w:val="0DA6E154"/>
@@ -7650,7 +7587,7 @@
       </w:rPr>
     </w:lvl>
   </w:abstractNum>
-  <w:abstractNum w:abstractNumId="33" w15:restartNumberingAfterBreak="0">
+  <w:abstractNum w:abstractNumId="34" w15:restartNumberingAfterBreak="0">
     <w:nsid w:val="6D9C4B47"/>
     <w:multiLevelType w:val="multilevel"/>
     <w:tmpl w:val="485A3218"/>
@@ -7799,7 +7736,7 @@
       </w:rPr>
     </w:lvl>
   </w:abstractNum>
-  <w:abstractNum w:abstractNumId="34" w15:restartNumberingAfterBreak="0">
+  <w:abstractNum w:abstractNumId="35" w15:restartNumberingAfterBreak="0">
     <w:nsid w:val="700E137B"/>
     <w:multiLevelType w:val="multilevel"/>
     <w:tmpl w:val="295C0F54"/>
@@ -7948,7 +7885,7 @@
       </w:rPr>
     </w:lvl>
   </w:abstractNum>
-  <w:abstractNum w:abstractNumId="35" w15:restartNumberingAfterBreak="0">
+  <w:abstractNum w:abstractNumId="36" w15:restartNumberingAfterBreak="0">
     <w:nsid w:val="70233503"/>
     <w:multiLevelType w:val="multilevel"/>
     <w:tmpl w:val="035C4DC0"/>
@@ -8097,7 +8034,7 @@
       </w:rPr>
     </w:lvl>
   </w:abstractNum>
-  <w:abstractNum w:abstractNumId="36" w15:restartNumberingAfterBreak="0">
+  <w:abstractNum w:abstractNumId="37" w15:restartNumberingAfterBreak="0">
     <w:nsid w:val="79E64A3F"/>
     <w:multiLevelType w:val="multilevel"/>
     <w:tmpl w:val="3D7C28DE"/>
@@ -8246,7 +8183,7 @@
       </w:rPr>
     </w:lvl>
   </w:abstractNum>
-  <w:abstractNum w:abstractNumId="37" w15:restartNumberingAfterBreak="0">
+  <w:abstractNum w:abstractNumId="38" w15:restartNumberingAfterBreak="0">
     <w:nsid w:val="7FD74163"/>
     <w:multiLevelType w:val="multilevel"/>
     <w:tmpl w:val="66E28A8C"/>
@@ -8432,13 +8369,13 @@
     <w:abstractNumId w:val="20"/>
   </w:num>
   <w:num w:numId="13" w16cid:durableId="1342246711">
-    <w:abstractNumId w:val="37"/>
+    <w:abstractNumId w:val="38"/>
   </w:num>
   <w:num w:numId="14" w16cid:durableId="898320651">
     <w:abstractNumId w:val="27"/>
   </w:num>
   <w:num w:numId="15" w16cid:durableId="191650073">
-    <w:abstractNumId w:val="35"/>
+    <w:abstractNumId w:val="36"/>
   </w:num>
   <w:num w:numId="16" w16cid:durableId="572355893">
     <w:abstractNumId w:val="22"/>
@@ -8450,13 +8387,13 @@
     <w:abstractNumId w:val="17"/>
   </w:num>
   <w:num w:numId="19" w16cid:durableId="1432504722">
-    <w:abstractNumId w:val="30"/>
+    <w:abstractNumId w:val="31"/>
   </w:num>
   <w:num w:numId="20" w16cid:durableId="330766159">
     <w:abstractNumId w:val="9"/>
   </w:num>
   <w:num w:numId="21" w16cid:durableId="881792581">
-    <w:abstractNumId w:val="34"/>
+    <w:abstractNumId w:val="35"/>
   </w:num>
   <w:num w:numId="22" w16cid:durableId="615647383">
     <w:abstractNumId w:val="0"/>
@@ -8480,10 +8417,10 @@
     <w:abstractNumId w:val="23"/>
   </w:num>
   <w:num w:numId="29" w16cid:durableId="233928807">
-    <w:abstractNumId w:val="33"/>
+    <w:abstractNumId w:val="34"/>
   </w:num>
   <w:num w:numId="30" w16cid:durableId="1343433674">
-    <w:abstractNumId w:val="29"/>
+    <w:abstractNumId w:val="30"/>
   </w:num>
   <w:num w:numId="31" w16cid:durableId="1693802210">
     <w:abstractNumId w:val="4"/>
@@ -8495,7 +8432,7 @@
     <w:abstractNumId w:val="2"/>
   </w:num>
   <w:num w:numId="34" w16cid:durableId="725447875">
-    <w:abstractNumId w:val="36"/>
+    <w:abstractNumId w:val="37"/>
   </w:num>
   <w:num w:numId="35" w16cid:durableId="1747871732">
     <w:abstractNumId w:val="8"/>
@@ -8504,10 +8441,13 @@
     <w:abstractNumId w:val="15"/>
   </w:num>
   <w:num w:numId="37" w16cid:durableId="1728601039">
-    <w:abstractNumId w:val="31"/>
+    <w:abstractNumId w:val="32"/>
   </w:num>
   <w:num w:numId="38" w16cid:durableId="151063216">
-    <w:abstractNumId w:val="32"/>
+    <w:abstractNumId w:val="33"/>
+  </w:num>
+  <w:num w:numId="39" w16cid:durableId="1270310067">
+    <w:abstractNumId w:val="29"/>
   </w:num>
 </w:numbering>
 </file>

</xml_diff>

<commit_message>
revision sur perceptron simple et multi couches et les architectures nlp one to one one to many many to one many to many
</commit_message>
<xml_diff>
--- a/plan d'apprentissage.docx
+++ b/plan d'apprentissage.docx
@@ -976,8 +976,30 @@
           <w:highlight w:val="yellow"/>
           <w:lang w:val="en-US"/>
         </w:rPr>
-        <w:t>Word embeddings statiques :</w:t>
-      </w:r>
+        <w:t xml:space="preserve">Word embeddings </w:t>
+      </w:r>
+      <w:proofErr w:type="spellStart"/>
+      <w:proofErr w:type="gramStart"/>
+      <w:r>
+        <w:rPr>
+          <w:b/>
+          <w:bCs/>
+          <w:highlight w:val="yellow"/>
+          <w:lang w:val="en-US"/>
+        </w:rPr>
+        <w:t>statiques</w:t>
+      </w:r>
+      <w:proofErr w:type="spellEnd"/>
+      <w:r>
+        <w:rPr>
+          <w:b/>
+          <w:bCs/>
+          <w:highlight w:val="yellow"/>
+          <w:lang w:val="en-US"/>
+        </w:rPr>
+        <w:t xml:space="preserve"> :</w:t>
+      </w:r>
+      <w:proofErr w:type="gramEnd"/>
     </w:p>
     <w:p>
       <w:pPr>
@@ -1113,30 +1135,6 @@
       </w:r>
     </w:p>
     <w:p>
-      <w:pPr>
-        <w:numPr>
-          <w:ilvl w:val="0"/>
-          <w:numId w:val="18"/>
-        </w:numPr>
-      </w:pPr>
-      <w:proofErr w:type="gramStart"/>
-      <w:r>
-        <w:t>limites</w:t>
-      </w:r>
-      <w:proofErr w:type="gramEnd"/>
-      <w:r>
-        <w:t xml:space="preserve"> (</w:t>
-      </w:r>
-      <w:proofErr w:type="spellStart"/>
-      <w:r>
-        <w:t>polysemy</w:t>
-      </w:r>
-      <w:proofErr w:type="spellEnd"/>
-      <w:r>
-        <w:t>)</w:t>
-      </w:r>
-    </w:p>
-    <w:p>
       <w:r>
         <w:rPr>
           <w:rFonts w:ascii="Segoe UI Symbol" w:hAnsi="Segoe UI Symbol" w:cs="Segoe UI Symbol"/>
@@ -1190,6 +1188,7 @@
         <w:rPr>
           <w:b/>
           <w:bCs/>
+          <w:lang w:val="en-US"/>
         </w:rPr>
       </w:pPr>
       <w:r>
@@ -1204,21 +1203,177 @@
         <w:rPr>
           <w:b/>
           <w:bCs/>
+          <w:lang w:val="en-US"/>
         </w:rPr>
         <w:t xml:space="preserve"> PHASE 6 — NLP + Deep Learning</w:t>
       </w:r>
     </w:p>
     <w:p>
-      <w:r>
+      <w:pPr>
+        <w:pStyle w:val="Paragraphedeliste"/>
+        <w:numPr>
+          <w:ilvl w:val="0"/>
+          <w:numId w:val="40"/>
+        </w:numPr>
         <w:rPr>
           <w:b/>
           <w:bCs/>
-        </w:rPr>
-        <w:t>Comprendre la révolution</w:t>
+          <w:highlight w:val="yellow"/>
+        </w:rPr>
+      </w:pPr>
+      <w:r>
+        <w:rPr>
+          <w:b/>
+          <w:bCs/>
+          <w:highlight w:val="yellow"/>
+        </w:rPr>
+        <w:t>Révision perceptron simple et multi couches</w:t>
       </w:r>
     </w:p>
     <w:p>
       <w:pPr>
+        <w:pStyle w:val="Paragraphedeliste"/>
+        <w:numPr>
+          <w:ilvl w:val="0"/>
+          <w:numId w:val="40"/>
+        </w:numPr>
+        <w:rPr>
+          <w:b/>
+          <w:bCs/>
+          <w:highlight w:val="yellow"/>
+        </w:rPr>
+      </w:pPr>
+      <w:r>
+        <w:rPr>
+          <w:b/>
+          <w:bCs/>
+          <w:highlight w:val="yellow"/>
+        </w:rPr>
+        <w:t xml:space="preserve">Les limites des réseaux </w:t>
+      </w:r>
+      <w:proofErr w:type="spellStart"/>
+      <w:r>
+        <w:rPr>
+          <w:b/>
+          <w:bCs/>
+          <w:highlight w:val="yellow"/>
+        </w:rPr>
+        <w:t>Feed</w:t>
+      </w:r>
+      <w:proofErr w:type="spellEnd"/>
+      <w:r>
+        <w:rPr>
+          <w:b/>
+          <w:bCs/>
+          <w:highlight w:val="yellow"/>
+        </w:rPr>
+        <w:t>-Forward : Pourquoi les réseaux classiques ne peuvent pas traiter des séquences de longueur variable.</w:t>
+      </w:r>
+    </w:p>
+    <w:p>
+      <w:r>
+        <w:t>Taille fixe : Un MLP possède un nombre fixe de neurones en entrée. Si tu as conçu un réseau pour lire des phrases de 10 mots, il ne saura pas quoi faire d'une phrase de 11 mots. Il faudrait "tronquer" ou ajouter du vide (</w:t>
+      </w:r>
+      <w:proofErr w:type="spellStart"/>
+      <w:r>
+        <w:t>padding</w:t>
+      </w:r>
+      <w:proofErr w:type="spellEnd"/>
+      <w:r>
+        <w:t>), ce qui n'est pas efficace.</w:t>
+      </w:r>
+    </w:p>
+    <w:p>
+      <w:r>
+        <w:t xml:space="preserve">Indépendance des données : Dans un réseau </w:t>
+      </w:r>
+      <w:proofErr w:type="spellStart"/>
+      <w:r>
+        <w:t>Feed</w:t>
+      </w:r>
+      <w:proofErr w:type="spellEnd"/>
+      <w:r>
+        <w:t>-Forward, le réseau traite x1 (le mot 1), puis x2(le mot 2), mais il a totalement "oublié" x1</w:t>
+      </w:r>
+      <w:r>
+        <w:t xml:space="preserve"> </w:t>
+      </w:r>
+      <w:r>
+        <w:t>quand il arrive à x2.</w:t>
+      </w:r>
+    </w:p>
+    <w:p>
+      <w:r>
+        <w:rPr>
+          <w:i/>
+          <w:iCs/>
+        </w:rPr>
+        <w:t>Exemple :</w:t>
+      </w:r>
+      <w:r>
+        <w:t xml:space="preserve"> Dans la phrase "Le chat est noir, il dort", pour comprendre que "il" désigne le "chat", le réseau doit avoir une mémoire. Un MLP classique voit juste "il" de manière isolée.</w:t>
+      </w:r>
+    </w:p>
+    <w:p>
+      <w:pPr>
+        <w:pStyle w:val="Paragraphedeliste"/>
+        <w:numPr>
+          <w:ilvl w:val="0"/>
+          <w:numId w:val="40"/>
+        </w:numPr>
+        <w:rPr>
+          <w:highlight w:val="yellow"/>
+          <w:lang w:val="en-US"/>
+        </w:rPr>
+      </w:pPr>
+      <w:r>
+        <w:rPr>
+          <w:b/>
+          <w:bCs/>
+          <w:highlight w:val="yellow"/>
+          <w:lang w:val="en-US"/>
+        </w:rPr>
+        <w:t xml:space="preserve">Architecture </w:t>
+      </w:r>
+      <w:proofErr w:type="spellStart"/>
+      <w:proofErr w:type="gramStart"/>
+      <w:r>
+        <w:rPr>
+          <w:b/>
+          <w:bCs/>
+          <w:highlight w:val="yellow"/>
+          <w:lang w:val="en-US"/>
+        </w:rPr>
+        <w:t>nlp</w:t>
+      </w:r>
+      <w:proofErr w:type="spellEnd"/>
+      <w:r>
+        <w:rPr>
+          <w:b/>
+          <w:bCs/>
+          <w:highlight w:val="yellow"/>
+          <w:lang w:val="en-US"/>
+        </w:rPr>
+        <w:t>( one</w:t>
+      </w:r>
+      <w:proofErr w:type="gramEnd"/>
+      <w:r>
+        <w:rPr>
+          <w:b/>
+          <w:bCs/>
+          <w:highlight w:val="yellow"/>
+          <w:lang w:val="en-US"/>
+        </w:rPr>
+        <w:t xml:space="preserve"> to one many to many)</w:t>
+      </w:r>
+    </w:p>
+    <w:p>
+      <w:pPr>
+        <w:pStyle w:val="Paragraphedeliste"/>
+        <w:numPr>
+          <w:ilvl w:val="0"/>
+          <w:numId w:val="40"/>
+        </w:numPr>
         <w:rPr>
           <w:b/>
           <w:bCs/>
@@ -1246,12 +1401,43 @@
     <w:p>
       <w:pPr>
         <w:numPr>
-          <w:ilvl w:val="0"/>
+          <w:ilvl w:val="1"/>
           <w:numId w:val="20"/>
         </w:numPr>
       </w:pPr>
       <w:r>
-        <w:t>LSTM</w:t>
+        <w:t xml:space="preserve">Architecture du RNN simple (mécanisme de boucle, </w:t>
+      </w:r>
+      <w:proofErr w:type="spellStart"/>
+      <w:r>
+        <w:t>hidden</w:t>
+      </w:r>
+      <w:proofErr w:type="spellEnd"/>
+      <w:r>
+        <w:t xml:space="preserve"> state, partage des poids)</w:t>
+      </w:r>
+    </w:p>
+    <w:p>
+      <w:pPr>
+        <w:numPr>
+          <w:ilvl w:val="1"/>
+          <w:numId w:val="20"/>
+        </w:numPr>
+        <w:rPr>
+          <w:lang w:val="en-US"/>
+        </w:rPr>
+      </w:pPr>
+      <w:r>
+        <w:rPr>
+          <w:lang w:val="en-US"/>
+        </w:rPr>
+        <w:t>Entrainment des RNN (Backpropagation Through Time (BPTT)</w:t>
+      </w:r>
+      <w:r>
+        <w:rPr>
+          <w:lang w:val="en-US"/>
+        </w:rPr>
+        <w:t>, exploding gradient, vanishing gradient))</w:t>
       </w:r>
     </w:p>
     <w:p>
@@ -1262,210 +1448,19 @@
         </w:numPr>
       </w:pPr>
       <w:r>
-        <w:t>GRU</w:t>
+        <w:t>LSTM</w:t>
       </w:r>
     </w:p>
     <w:p>
       <w:pPr>
-        <w:rPr>
-          <w:b/>
-          <w:bCs/>
-        </w:rPr>
-      </w:pPr>
-      <w:r>
-        <w:rPr>
-          <w:b/>
-          <w:bCs/>
-        </w:rPr>
-        <w:t>Architectures NLP :</w:t>
-      </w:r>
-    </w:p>
-    <w:p>
-      <w:pPr>
         <w:numPr>
           <w:ilvl w:val="0"/>
-          <w:numId w:val="21"/>
+          <w:numId w:val="20"/>
         </w:numPr>
       </w:pPr>
-      <w:proofErr w:type="spellStart"/>
-      <w:proofErr w:type="gramStart"/>
-      <w:r>
-        <w:t>many</w:t>
-      </w:r>
-      <w:proofErr w:type="spellEnd"/>
-      <w:proofErr w:type="gramEnd"/>
-      <w:r>
-        <w:t>-to-one</w:t>
-      </w:r>
-    </w:p>
-    <w:p>
-      <w:pPr>
-        <w:numPr>
-          <w:ilvl w:val="0"/>
-          <w:numId w:val="21"/>
-        </w:numPr>
-      </w:pPr>
-      <w:proofErr w:type="spellStart"/>
-      <w:proofErr w:type="gramStart"/>
-      <w:r>
-        <w:t>many</w:t>
-      </w:r>
-      <w:proofErr w:type="spellEnd"/>
-      <w:proofErr w:type="gramEnd"/>
-      <w:r>
-        <w:t>-to-</w:t>
-      </w:r>
-      <w:proofErr w:type="spellStart"/>
-      <w:r>
-        <w:t>many</w:t>
-      </w:r>
-      <w:proofErr w:type="spellEnd"/>
-    </w:p>
-    <w:p>
-      <w:pPr>
-        <w:rPr>
-          <w:b/>
-          <w:bCs/>
-        </w:rPr>
-      </w:pPr>
-      <w:r>
-        <w:rPr>
-          <w:b/>
-          <w:bCs/>
-        </w:rPr>
-        <w:t>Applications :</w:t>
-      </w:r>
-    </w:p>
-    <w:p>
-      <w:pPr>
-        <w:numPr>
-          <w:ilvl w:val="0"/>
-          <w:numId w:val="22"/>
-        </w:numPr>
-      </w:pPr>
-      <w:proofErr w:type="gramStart"/>
-      <w:r>
-        <w:t>sentiment</w:t>
-      </w:r>
-      <w:proofErr w:type="gramEnd"/>
-      <w:r>
-        <w:t xml:space="preserve"> </w:t>
-      </w:r>
-      <w:proofErr w:type="spellStart"/>
-      <w:r>
-        <w:t>analysis</w:t>
-      </w:r>
-      <w:proofErr w:type="spellEnd"/>
-    </w:p>
-    <w:p>
-      <w:pPr>
-        <w:numPr>
-          <w:ilvl w:val="0"/>
-          <w:numId w:val="22"/>
-        </w:numPr>
-      </w:pPr>
-      <w:r>
-        <w:t>NER</w:t>
-      </w:r>
-    </w:p>
-    <w:p>
-      <w:pPr>
-        <w:numPr>
-          <w:ilvl w:val="0"/>
-          <w:numId w:val="22"/>
-        </w:numPr>
-      </w:pPr>
-      <w:r>
-        <w:t xml:space="preserve">POS </w:t>
-      </w:r>
-      <w:proofErr w:type="spellStart"/>
-      <w:r>
-        <w:t>tagging</w:t>
-      </w:r>
-      <w:proofErr w:type="spellEnd"/>
-    </w:p>
-    <w:p>
-      <w:pPr>
-        <w:numPr>
-          <w:ilvl w:val="0"/>
-          <w:numId w:val="22"/>
-        </w:numPr>
-      </w:pPr>
-      <w:proofErr w:type="spellStart"/>
-      <w:proofErr w:type="gramStart"/>
-      <w:r>
-        <w:t>text</w:t>
-      </w:r>
-      <w:proofErr w:type="spellEnd"/>
-      <w:proofErr w:type="gramEnd"/>
-      <w:r>
-        <w:t xml:space="preserve"> </w:t>
-      </w:r>
-      <w:proofErr w:type="spellStart"/>
-      <w:r>
-        <w:t>generation</w:t>
-      </w:r>
-      <w:proofErr w:type="spellEnd"/>
-    </w:p>
-    <w:p>
-      <w:r>
-        <w:rPr>
-          <w:rFonts w:ascii="Segoe UI Symbol" w:hAnsi="Segoe UI Symbol" w:cs="Segoe UI Symbol"/>
-        </w:rPr>
-        <w:t>🛠</w:t>
-      </w:r>
-      <w:r>
-        <w:t xml:space="preserve"> </w:t>
-      </w:r>
-      <w:proofErr w:type="spellStart"/>
-      <w:r>
-        <w:rPr>
-          <w:b/>
-          <w:bCs/>
-        </w:rPr>
-        <w:t>Frameworks</w:t>
-      </w:r>
-      <w:proofErr w:type="spellEnd"/>
-      <w:r>
-        <w:t xml:space="preserve"> :</w:t>
-      </w:r>
-    </w:p>
-    <w:p>
-      <w:pPr>
-        <w:numPr>
-          <w:ilvl w:val="0"/>
-          <w:numId w:val="23"/>
-        </w:numPr>
-      </w:pPr>
-      <w:proofErr w:type="spellStart"/>
-      <w:r>
-        <w:t>PyTorch</w:t>
-      </w:r>
-      <w:proofErr w:type="spellEnd"/>
-      <w:r>
-        <w:t xml:space="preserve"> (recommandé)</w:t>
-      </w:r>
-    </w:p>
-    <w:p>
-      <w:pPr>
-        <w:numPr>
-          <w:ilvl w:val="0"/>
-          <w:numId w:val="23"/>
-        </w:numPr>
-      </w:pPr>
-      <w:proofErr w:type="spellStart"/>
-      <w:r>
-        <w:t>TensorFlow</w:t>
-      </w:r>
-      <w:proofErr w:type="spellEnd"/>
-      <w:r>
-        <w:t xml:space="preserve"> / </w:t>
-      </w:r>
-      <w:proofErr w:type="spellStart"/>
-      <w:r>
-        <w:t>Keras</w:t>
-      </w:r>
-      <w:proofErr w:type="spellEnd"/>
+      <w:r>
+        <w:t>GRU</w:t>
+      </w:r>
     </w:p>
     <w:p>
       <w:r>
@@ -1654,117 +1649,6 @@
         <w:t>encoding</w:t>
       </w:r>
       <w:proofErr w:type="spellEnd"/>
-    </w:p>
-    <w:p>
-      <w:pPr>
-        <w:rPr>
-          <w:b/>
-          <w:bCs/>
-        </w:rPr>
-      </w:pPr>
-      <w:r>
-        <w:rPr>
-          <w:b/>
-          <w:bCs/>
-        </w:rPr>
-        <w:t>Modèles clés :</w:t>
-      </w:r>
-    </w:p>
-    <w:p>
-      <w:pPr>
-        <w:numPr>
-          <w:ilvl w:val="0"/>
-          <w:numId w:val="26"/>
-        </w:numPr>
-      </w:pPr>
-      <w:r>
-        <w:t>BERT</w:t>
-      </w:r>
-    </w:p>
-    <w:p>
-      <w:pPr>
-        <w:numPr>
-          <w:ilvl w:val="0"/>
-          <w:numId w:val="26"/>
-        </w:numPr>
-      </w:pPr>
-      <w:r>
-        <w:t>GPT</w:t>
-      </w:r>
-    </w:p>
-    <w:p>
-      <w:pPr>
-        <w:numPr>
-          <w:ilvl w:val="0"/>
-          <w:numId w:val="26"/>
-        </w:numPr>
-      </w:pPr>
-      <w:proofErr w:type="spellStart"/>
-      <w:r>
-        <w:t>RoBERTa</w:t>
-      </w:r>
-      <w:proofErr w:type="spellEnd"/>
-    </w:p>
-    <w:p>
-      <w:pPr>
-        <w:numPr>
-          <w:ilvl w:val="0"/>
-          <w:numId w:val="26"/>
-        </w:numPr>
-      </w:pPr>
-      <w:r>
-        <w:t>T5</w:t>
-      </w:r>
-    </w:p>
-    <w:p>
-      <w:pPr>
-        <w:numPr>
-          <w:ilvl w:val="0"/>
-          <w:numId w:val="26"/>
-        </w:numPr>
-      </w:pPr>
-      <w:proofErr w:type="spellStart"/>
-      <w:r>
-        <w:t>DistilBERT</w:t>
-      </w:r>
-      <w:proofErr w:type="spellEnd"/>
-    </w:p>
-    <w:p>
-      <w:r>
-        <w:rPr>
-          <w:rFonts w:ascii="Segoe UI Symbol" w:hAnsi="Segoe UI Symbol" w:cs="Segoe UI Symbol"/>
-        </w:rPr>
-        <w:t>🛠</w:t>
-      </w:r>
-      <w:r>
-        <w:t xml:space="preserve"> </w:t>
-      </w:r>
-      <w:r>
-        <w:rPr>
-          <w:b/>
-          <w:bCs/>
-        </w:rPr>
-        <w:t>Librairie</w:t>
-      </w:r>
-      <w:r>
-        <w:t xml:space="preserve"> :</w:t>
-      </w:r>
-    </w:p>
-    <w:p>
-      <w:pPr>
-        <w:numPr>
-          <w:ilvl w:val="0"/>
-          <w:numId w:val="27"/>
-        </w:numPr>
-      </w:pPr>
-      <w:proofErr w:type="spellStart"/>
-      <w:r>
-        <w:t>Hugging</w:t>
-      </w:r>
-      <w:proofErr w:type="spellEnd"/>
-      <w:r>
-        <w:t xml:space="preserve"> Face Transformers</w:t>
-      </w:r>
     </w:p>
     <w:p/>
     <w:p/>
@@ -3124,6 +3008,155 @@
     </w:lvl>
   </w:abstractNum>
   <w:abstractNum w:abstractNumId="9" w15:restartNumberingAfterBreak="0">
+    <w:nsid w:val="2273580E"/>
+    <w:multiLevelType w:val="multilevel"/>
+    <w:tmpl w:val="B0CAC5BE"/>
+    <w:lvl w:ilvl="0">
+      <w:start w:val="1"/>
+      <w:numFmt w:val="bullet"/>
+      <w:lvlText w:val=""/>
+      <w:lvlJc w:val="left"/>
+      <w:pPr>
+        <w:tabs>
+          <w:tab w:val="num" w:pos="720"/>
+        </w:tabs>
+        <w:ind w:left="720" w:hanging="360"/>
+      </w:pPr>
+      <w:rPr>
+        <w:rFonts w:ascii="Symbol" w:hAnsi="Symbol" w:hint="default"/>
+        <w:sz w:val="20"/>
+      </w:rPr>
+    </w:lvl>
+    <w:lvl w:ilvl="1" w:tentative="1">
+      <w:start w:val="1"/>
+      <w:numFmt w:val="bullet"/>
+      <w:lvlText w:val="o"/>
+      <w:lvlJc w:val="left"/>
+      <w:pPr>
+        <w:tabs>
+          <w:tab w:val="num" w:pos="1440"/>
+        </w:tabs>
+        <w:ind w:left="1440" w:hanging="360"/>
+      </w:pPr>
+      <w:rPr>
+        <w:rFonts w:ascii="Courier New" w:hAnsi="Courier New" w:hint="default"/>
+        <w:sz w:val="20"/>
+      </w:rPr>
+    </w:lvl>
+    <w:lvl w:ilvl="2" w:tentative="1">
+      <w:start w:val="1"/>
+      <w:numFmt w:val="bullet"/>
+      <w:lvlText w:val=""/>
+      <w:lvlJc w:val="left"/>
+      <w:pPr>
+        <w:tabs>
+          <w:tab w:val="num" w:pos="2160"/>
+        </w:tabs>
+        <w:ind w:left="2160" w:hanging="360"/>
+      </w:pPr>
+      <w:rPr>
+        <w:rFonts w:ascii="Wingdings" w:hAnsi="Wingdings" w:hint="default"/>
+        <w:sz w:val="20"/>
+      </w:rPr>
+    </w:lvl>
+    <w:lvl w:ilvl="3" w:tentative="1">
+      <w:start w:val="1"/>
+      <w:numFmt w:val="bullet"/>
+      <w:lvlText w:val=""/>
+      <w:lvlJc w:val="left"/>
+      <w:pPr>
+        <w:tabs>
+          <w:tab w:val="num" w:pos="2880"/>
+        </w:tabs>
+        <w:ind w:left="2880" w:hanging="360"/>
+      </w:pPr>
+      <w:rPr>
+        <w:rFonts w:ascii="Wingdings" w:hAnsi="Wingdings" w:hint="default"/>
+        <w:sz w:val="20"/>
+      </w:rPr>
+    </w:lvl>
+    <w:lvl w:ilvl="4" w:tentative="1">
+      <w:start w:val="1"/>
+      <w:numFmt w:val="bullet"/>
+      <w:lvlText w:val=""/>
+      <w:lvlJc w:val="left"/>
+      <w:pPr>
+        <w:tabs>
+          <w:tab w:val="num" w:pos="3600"/>
+        </w:tabs>
+        <w:ind w:left="3600" w:hanging="360"/>
+      </w:pPr>
+      <w:rPr>
+        <w:rFonts w:ascii="Wingdings" w:hAnsi="Wingdings" w:hint="default"/>
+        <w:sz w:val="20"/>
+      </w:rPr>
+    </w:lvl>
+    <w:lvl w:ilvl="5" w:tentative="1">
+      <w:start w:val="1"/>
+      <w:numFmt w:val="bullet"/>
+      <w:lvlText w:val=""/>
+      <w:lvlJc w:val="left"/>
+      <w:pPr>
+        <w:tabs>
+          <w:tab w:val="num" w:pos="4320"/>
+        </w:tabs>
+        <w:ind w:left="4320" w:hanging="360"/>
+      </w:pPr>
+      <w:rPr>
+        <w:rFonts w:ascii="Wingdings" w:hAnsi="Wingdings" w:hint="default"/>
+        <w:sz w:val="20"/>
+      </w:rPr>
+    </w:lvl>
+    <w:lvl w:ilvl="6" w:tentative="1">
+      <w:start w:val="1"/>
+      <w:numFmt w:val="bullet"/>
+      <w:lvlText w:val=""/>
+      <w:lvlJc w:val="left"/>
+      <w:pPr>
+        <w:tabs>
+          <w:tab w:val="num" w:pos="5040"/>
+        </w:tabs>
+        <w:ind w:left="5040" w:hanging="360"/>
+      </w:pPr>
+      <w:rPr>
+        <w:rFonts w:ascii="Wingdings" w:hAnsi="Wingdings" w:hint="default"/>
+        <w:sz w:val="20"/>
+      </w:rPr>
+    </w:lvl>
+    <w:lvl w:ilvl="7" w:tentative="1">
+      <w:start w:val="1"/>
+      <w:numFmt w:val="bullet"/>
+      <w:lvlText w:val=""/>
+      <w:lvlJc w:val="left"/>
+      <w:pPr>
+        <w:tabs>
+          <w:tab w:val="num" w:pos="5760"/>
+        </w:tabs>
+        <w:ind w:left="5760" w:hanging="360"/>
+      </w:pPr>
+      <w:rPr>
+        <w:rFonts w:ascii="Wingdings" w:hAnsi="Wingdings" w:hint="default"/>
+        <w:sz w:val="20"/>
+      </w:rPr>
+    </w:lvl>
+    <w:lvl w:ilvl="8" w:tentative="1">
+      <w:start w:val="1"/>
+      <w:numFmt w:val="bullet"/>
+      <w:lvlText w:val=""/>
+      <w:lvlJc w:val="left"/>
+      <w:pPr>
+        <w:tabs>
+          <w:tab w:val="num" w:pos="6480"/>
+        </w:tabs>
+        <w:ind w:left="6480" w:hanging="360"/>
+      </w:pPr>
+      <w:rPr>
+        <w:rFonts w:ascii="Wingdings" w:hAnsi="Wingdings" w:hint="default"/>
+        <w:sz w:val="20"/>
+      </w:rPr>
+    </w:lvl>
+  </w:abstractNum>
+  <w:abstractNum w:abstractNumId="10" w15:restartNumberingAfterBreak="0">
     <w:nsid w:val="2620534D"/>
     <w:multiLevelType w:val="multilevel"/>
     <w:tmpl w:val="E0CC8232"/>
@@ -3143,7 +3176,7 @@
         <w:sz w:val="20"/>
       </w:rPr>
     </w:lvl>
-    <w:lvl w:ilvl="1" w:tentative="1">
+    <w:lvl w:ilvl="1">
       <w:start w:val="1"/>
       <w:numFmt w:val="bullet"/>
       <w:lvlText w:val="o"/>
@@ -3272,7 +3305,7 @@
       </w:rPr>
     </w:lvl>
   </w:abstractNum>
-  <w:abstractNum w:abstractNumId="10" w15:restartNumberingAfterBreak="0">
+  <w:abstractNum w:abstractNumId="11" w15:restartNumberingAfterBreak="0">
     <w:nsid w:val="273A2069"/>
     <w:multiLevelType w:val="multilevel"/>
     <w:tmpl w:val="19DC8EEE"/>
@@ -3421,7 +3454,93 @@
       </w:rPr>
     </w:lvl>
   </w:abstractNum>
-  <w:abstractNum w:abstractNumId="11" w15:restartNumberingAfterBreak="0">
+  <w:abstractNum w:abstractNumId="12" w15:restartNumberingAfterBreak="0">
+    <w:nsid w:val="2EB50C77"/>
+    <w:multiLevelType w:val="hybridMultilevel"/>
+    <w:tmpl w:val="CCB6FB52"/>
+    <w:lvl w:ilvl="0" w:tplc="040C000F">
+      <w:start w:val="1"/>
+      <w:numFmt w:val="decimal"/>
+      <w:lvlText w:val="%1."/>
+      <w:lvlJc w:val="left"/>
+      <w:pPr>
+        <w:ind w:left="720" w:hanging="360"/>
+      </w:pPr>
+    </w:lvl>
+    <w:lvl w:ilvl="1" w:tplc="040C0019" w:tentative="1">
+      <w:start w:val="1"/>
+      <w:numFmt w:val="lowerLetter"/>
+      <w:lvlText w:val="%2."/>
+      <w:lvlJc w:val="left"/>
+      <w:pPr>
+        <w:ind w:left="1440" w:hanging="360"/>
+      </w:pPr>
+    </w:lvl>
+    <w:lvl w:ilvl="2" w:tplc="040C001B" w:tentative="1">
+      <w:start w:val="1"/>
+      <w:numFmt w:val="lowerRoman"/>
+      <w:lvlText w:val="%3."/>
+      <w:lvlJc w:val="right"/>
+      <w:pPr>
+        <w:ind w:left="2160" w:hanging="180"/>
+      </w:pPr>
+    </w:lvl>
+    <w:lvl w:ilvl="3" w:tplc="040C000F" w:tentative="1">
+      <w:start w:val="1"/>
+      <w:numFmt w:val="decimal"/>
+      <w:lvlText w:val="%4."/>
+      <w:lvlJc w:val="left"/>
+      <w:pPr>
+        <w:ind w:left="2880" w:hanging="360"/>
+      </w:pPr>
+    </w:lvl>
+    <w:lvl w:ilvl="4" w:tplc="040C0019" w:tentative="1">
+      <w:start w:val="1"/>
+      <w:numFmt w:val="lowerLetter"/>
+      <w:lvlText w:val="%5."/>
+      <w:lvlJc w:val="left"/>
+      <w:pPr>
+        <w:ind w:left="3600" w:hanging="360"/>
+      </w:pPr>
+    </w:lvl>
+    <w:lvl w:ilvl="5" w:tplc="040C001B" w:tentative="1">
+      <w:start w:val="1"/>
+      <w:numFmt w:val="lowerRoman"/>
+      <w:lvlText w:val="%6."/>
+      <w:lvlJc w:val="right"/>
+      <w:pPr>
+        <w:ind w:left="4320" w:hanging="180"/>
+      </w:pPr>
+    </w:lvl>
+    <w:lvl w:ilvl="6" w:tplc="040C000F" w:tentative="1">
+      <w:start w:val="1"/>
+      <w:numFmt w:val="decimal"/>
+      <w:lvlText w:val="%7."/>
+      <w:lvlJc w:val="left"/>
+      <w:pPr>
+        <w:ind w:left="5040" w:hanging="360"/>
+      </w:pPr>
+    </w:lvl>
+    <w:lvl w:ilvl="7" w:tplc="040C0019" w:tentative="1">
+      <w:start w:val="1"/>
+      <w:numFmt w:val="lowerLetter"/>
+      <w:lvlText w:val="%8."/>
+      <w:lvlJc w:val="left"/>
+      <w:pPr>
+        <w:ind w:left="5760" w:hanging="360"/>
+      </w:pPr>
+    </w:lvl>
+    <w:lvl w:ilvl="8" w:tplc="040C001B" w:tentative="1">
+      <w:start w:val="1"/>
+      <w:numFmt w:val="lowerRoman"/>
+      <w:lvlText w:val="%9."/>
+      <w:lvlJc w:val="right"/>
+      <w:pPr>
+        <w:ind w:left="6480" w:hanging="180"/>
+      </w:pPr>
+    </w:lvl>
+  </w:abstractNum>
+  <w:abstractNum w:abstractNumId="13" w15:restartNumberingAfterBreak="0">
     <w:nsid w:val="320522F5"/>
     <w:multiLevelType w:val="multilevel"/>
     <w:tmpl w:val="8C5C4C54"/>
@@ -3570,7 +3689,7 @@
       </w:rPr>
     </w:lvl>
   </w:abstractNum>
-  <w:abstractNum w:abstractNumId="12" w15:restartNumberingAfterBreak="0">
+  <w:abstractNum w:abstractNumId="14" w15:restartNumberingAfterBreak="0">
     <w:nsid w:val="357B708A"/>
     <w:multiLevelType w:val="multilevel"/>
     <w:tmpl w:val="496AE82C"/>
@@ -3719,7 +3838,7 @@
       </w:rPr>
     </w:lvl>
   </w:abstractNum>
-  <w:abstractNum w:abstractNumId="13" w15:restartNumberingAfterBreak="0">
+  <w:abstractNum w:abstractNumId="15" w15:restartNumberingAfterBreak="0">
     <w:nsid w:val="3ED65DBB"/>
     <w:multiLevelType w:val="multilevel"/>
     <w:tmpl w:val="33440702"/>
@@ -3868,7 +3987,7 @@
       </w:rPr>
     </w:lvl>
   </w:abstractNum>
-  <w:abstractNum w:abstractNumId="14" w15:restartNumberingAfterBreak="0">
+  <w:abstractNum w:abstractNumId="16" w15:restartNumberingAfterBreak="0">
     <w:nsid w:val="40E271B2"/>
     <w:multiLevelType w:val="multilevel"/>
     <w:tmpl w:val="2B328602"/>
@@ -4017,7 +4136,7 @@
       </w:rPr>
     </w:lvl>
   </w:abstractNum>
-  <w:abstractNum w:abstractNumId="15" w15:restartNumberingAfterBreak="0">
+  <w:abstractNum w:abstractNumId="17" w15:restartNumberingAfterBreak="0">
     <w:nsid w:val="41FF27BA"/>
     <w:multiLevelType w:val="multilevel"/>
     <w:tmpl w:val="9AD453D4"/>
@@ -4166,7 +4285,7 @@
       </w:rPr>
     </w:lvl>
   </w:abstractNum>
-  <w:abstractNum w:abstractNumId="16" w15:restartNumberingAfterBreak="0">
+  <w:abstractNum w:abstractNumId="18" w15:restartNumberingAfterBreak="0">
     <w:nsid w:val="42A206E9"/>
     <w:multiLevelType w:val="multilevel"/>
     <w:tmpl w:val="7A78C4EA"/>
@@ -4315,7 +4434,7 @@
       </w:rPr>
     </w:lvl>
   </w:abstractNum>
-  <w:abstractNum w:abstractNumId="17" w15:restartNumberingAfterBreak="0">
+  <w:abstractNum w:abstractNumId="19" w15:restartNumberingAfterBreak="0">
     <w:nsid w:val="45EA59A9"/>
     <w:multiLevelType w:val="multilevel"/>
     <w:tmpl w:val="EE1C689A"/>
@@ -4464,7 +4583,7 @@
       </w:rPr>
     </w:lvl>
   </w:abstractNum>
-  <w:abstractNum w:abstractNumId="18" w15:restartNumberingAfterBreak="0">
+  <w:abstractNum w:abstractNumId="20" w15:restartNumberingAfterBreak="0">
     <w:nsid w:val="47827901"/>
     <w:multiLevelType w:val="multilevel"/>
     <w:tmpl w:val="E3A4A9BC"/>
@@ -4613,7 +4732,7 @@
       </w:rPr>
     </w:lvl>
   </w:abstractNum>
-  <w:abstractNum w:abstractNumId="19" w15:restartNumberingAfterBreak="0">
+  <w:abstractNum w:abstractNumId="21" w15:restartNumberingAfterBreak="0">
     <w:nsid w:val="4F6B7AFE"/>
     <w:multiLevelType w:val="multilevel"/>
     <w:tmpl w:val="530EC574"/>
@@ -4762,7 +4881,7 @@
       </w:rPr>
     </w:lvl>
   </w:abstractNum>
-  <w:abstractNum w:abstractNumId="20" w15:restartNumberingAfterBreak="0">
+  <w:abstractNum w:abstractNumId="22" w15:restartNumberingAfterBreak="0">
     <w:nsid w:val="50157D29"/>
     <w:multiLevelType w:val="multilevel"/>
     <w:tmpl w:val="D89C8592"/>
@@ -4911,7 +5030,7 @@
       </w:rPr>
     </w:lvl>
   </w:abstractNum>
-  <w:abstractNum w:abstractNumId="21" w15:restartNumberingAfterBreak="0">
+  <w:abstractNum w:abstractNumId="23" w15:restartNumberingAfterBreak="0">
     <w:nsid w:val="514B6CEF"/>
     <w:multiLevelType w:val="multilevel"/>
     <w:tmpl w:val="D676E89E"/>
@@ -5060,7 +5179,7 @@
       </w:rPr>
     </w:lvl>
   </w:abstractNum>
-  <w:abstractNum w:abstractNumId="22" w15:restartNumberingAfterBreak="0">
+  <w:abstractNum w:abstractNumId="24" w15:restartNumberingAfterBreak="0">
     <w:nsid w:val="53052EB7"/>
     <w:multiLevelType w:val="multilevel"/>
     <w:tmpl w:val="A18048DA"/>
@@ -5209,7 +5328,7 @@
       </w:rPr>
     </w:lvl>
   </w:abstractNum>
-  <w:abstractNum w:abstractNumId="23" w15:restartNumberingAfterBreak="0">
+  <w:abstractNum w:abstractNumId="25" w15:restartNumberingAfterBreak="0">
     <w:nsid w:val="55C653DB"/>
     <w:multiLevelType w:val="multilevel"/>
     <w:tmpl w:val="61742F42"/>
@@ -5358,7 +5477,7 @@
       </w:rPr>
     </w:lvl>
   </w:abstractNum>
-  <w:abstractNum w:abstractNumId="24" w15:restartNumberingAfterBreak="0">
+  <w:abstractNum w:abstractNumId="26" w15:restartNumberingAfterBreak="0">
     <w:nsid w:val="560B202A"/>
     <w:multiLevelType w:val="multilevel"/>
     <w:tmpl w:val="37B46FF0"/>
@@ -5507,7 +5626,7 @@
       </w:rPr>
     </w:lvl>
   </w:abstractNum>
-  <w:abstractNum w:abstractNumId="25" w15:restartNumberingAfterBreak="0">
+  <w:abstractNum w:abstractNumId="27" w15:restartNumberingAfterBreak="0">
     <w:nsid w:val="56571D45"/>
     <w:multiLevelType w:val="multilevel"/>
     <w:tmpl w:val="15CA66C2"/>
@@ -5656,7 +5775,7 @@
       </w:rPr>
     </w:lvl>
   </w:abstractNum>
-  <w:abstractNum w:abstractNumId="26" w15:restartNumberingAfterBreak="0">
+  <w:abstractNum w:abstractNumId="28" w15:restartNumberingAfterBreak="0">
     <w:nsid w:val="569B3D36"/>
     <w:multiLevelType w:val="multilevel"/>
     <w:tmpl w:val="F768F89E"/>
@@ -5805,7 +5924,7 @@
       </w:rPr>
     </w:lvl>
   </w:abstractNum>
-  <w:abstractNum w:abstractNumId="27" w15:restartNumberingAfterBreak="0">
+  <w:abstractNum w:abstractNumId="29" w15:restartNumberingAfterBreak="0">
     <w:nsid w:val="582C503A"/>
     <w:multiLevelType w:val="multilevel"/>
     <w:tmpl w:val="2EDAB38A"/>
@@ -5954,7 +6073,7 @@
       </w:rPr>
     </w:lvl>
   </w:abstractNum>
-  <w:abstractNum w:abstractNumId="28" w15:restartNumberingAfterBreak="0">
+  <w:abstractNum w:abstractNumId="30" w15:restartNumberingAfterBreak="0">
     <w:nsid w:val="58CC59A1"/>
     <w:multiLevelType w:val="multilevel"/>
     <w:tmpl w:val="70B8D900"/>
@@ -6103,7 +6222,7 @@
       </w:rPr>
     </w:lvl>
   </w:abstractNum>
-  <w:abstractNum w:abstractNumId="29" w15:restartNumberingAfterBreak="0">
+  <w:abstractNum w:abstractNumId="31" w15:restartNumberingAfterBreak="0">
     <w:nsid w:val="62AF164A"/>
     <w:multiLevelType w:val="hybridMultilevel"/>
     <w:tmpl w:val="78722128"/>
@@ -6216,7 +6335,7 @@
       </w:rPr>
     </w:lvl>
   </w:abstractNum>
-  <w:abstractNum w:abstractNumId="30" w15:restartNumberingAfterBreak="0">
+  <w:abstractNum w:abstractNumId="32" w15:restartNumberingAfterBreak="0">
     <w:nsid w:val="671F4F6A"/>
     <w:multiLevelType w:val="multilevel"/>
     <w:tmpl w:val="B720CBB0"/>
@@ -6365,7 +6484,7 @@
       </w:rPr>
     </w:lvl>
   </w:abstractNum>
-  <w:abstractNum w:abstractNumId="31" w15:restartNumberingAfterBreak="0">
+  <w:abstractNum w:abstractNumId="33" w15:restartNumberingAfterBreak="0">
     <w:nsid w:val="67C0765E"/>
     <w:multiLevelType w:val="multilevel"/>
     <w:tmpl w:val="8DBA8D00"/>
@@ -6514,7 +6633,7 @@
       </w:rPr>
     </w:lvl>
   </w:abstractNum>
-  <w:abstractNum w:abstractNumId="32" w15:restartNumberingAfterBreak="0">
+  <w:abstractNum w:abstractNumId="34" w15:restartNumberingAfterBreak="0">
     <w:nsid w:val="6870703A"/>
     <w:multiLevelType w:val="multilevel"/>
     <w:tmpl w:val="44060C4A"/>
@@ -6663,7 +6782,7 @@
       </w:rPr>
     </w:lvl>
   </w:abstractNum>
-  <w:abstractNum w:abstractNumId="33" w15:restartNumberingAfterBreak="0">
+  <w:abstractNum w:abstractNumId="35" w15:restartNumberingAfterBreak="0">
     <w:nsid w:val="6C77707F"/>
     <w:multiLevelType w:val="multilevel"/>
     <w:tmpl w:val="0DA6E154"/>
@@ -6812,7 +6931,7 @@
       </w:rPr>
     </w:lvl>
   </w:abstractNum>
-  <w:abstractNum w:abstractNumId="34" w15:restartNumberingAfterBreak="0">
+  <w:abstractNum w:abstractNumId="36" w15:restartNumberingAfterBreak="0">
     <w:nsid w:val="6D9C4B47"/>
     <w:multiLevelType w:val="multilevel"/>
     <w:tmpl w:val="485A3218"/>
@@ -6961,7 +7080,7 @@
       </w:rPr>
     </w:lvl>
   </w:abstractNum>
-  <w:abstractNum w:abstractNumId="35" w15:restartNumberingAfterBreak="0">
+  <w:abstractNum w:abstractNumId="37" w15:restartNumberingAfterBreak="0">
     <w:nsid w:val="700E137B"/>
     <w:multiLevelType w:val="multilevel"/>
     <w:tmpl w:val="295C0F54"/>
@@ -7110,7 +7229,7 @@
       </w:rPr>
     </w:lvl>
   </w:abstractNum>
-  <w:abstractNum w:abstractNumId="36" w15:restartNumberingAfterBreak="0">
+  <w:abstractNum w:abstractNumId="38" w15:restartNumberingAfterBreak="0">
     <w:nsid w:val="70233503"/>
     <w:multiLevelType w:val="multilevel"/>
     <w:tmpl w:val="035C4DC0"/>
@@ -7259,7 +7378,7 @@
       </w:rPr>
     </w:lvl>
   </w:abstractNum>
-  <w:abstractNum w:abstractNumId="37" w15:restartNumberingAfterBreak="0">
+  <w:abstractNum w:abstractNumId="39" w15:restartNumberingAfterBreak="0">
     <w:nsid w:val="79E64A3F"/>
     <w:multiLevelType w:val="multilevel"/>
     <w:tmpl w:val="3D7C28DE"/>
@@ -7408,7 +7527,7 @@
       </w:rPr>
     </w:lvl>
   </w:abstractNum>
-  <w:abstractNum w:abstractNumId="38" w15:restartNumberingAfterBreak="0">
+  <w:abstractNum w:abstractNumId="40" w15:restartNumberingAfterBreak="0">
     <w:nsid w:val="7FD74163"/>
     <w:multiLevelType w:val="multilevel"/>
     <w:tmpl w:val="66E28A8C"/>
@@ -7558,31 +7677,31 @@
     </w:lvl>
   </w:abstractNum>
   <w:num w:numId="1" w16cid:durableId="531043074">
-    <w:abstractNumId w:val="18"/>
+    <w:abstractNumId w:val="20"/>
   </w:num>
   <w:num w:numId="2" w16cid:durableId="1195726253">
-    <w:abstractNumId w:val="26"/>
+    <w:abstractNumId w:val="28"/>
   </w:num>
   <w:num w:numId="3" w16cid:durableId="2064672862">
     <w:abstractNumId w:val="3"/>
   </w:num>
   <w:num w:numId="4" w16cid:durableId="1597399605">
-    <w:abstractNumId w:val="11"/>
+    <w:abstractNumId w:val="13"/>
   </w:num>
   <w:num w:numId="5" w16cid:durableId="1625193154">
-    <w:abstractNumId w:val="25"/>
+    <w:abstractNumId w:val="27"/>
   </w:num>
   <w:num w:numId="6" w16cid:durableId="1094398827">
-    <w:abstractNumId w:val="14"/>
+    <w:abstractNumId w:val="16"/>
   </w:num>
   <w:num w:numId="7" w16cid:durableId="917327308">
-    <w:abstractNumId w:val="28"/>
+    <w:abstractNumId w:val="30"/>
   </w:num>
   <w:num w:numId="8" w16cid:durableId="1209343085">
-    <w:abstractNumId w:val="19"/>
+    <w:abstractNumId w:val="21"/>
   </w:num>
   <w:num w:numId="9" w16cid:durableId="842475396">
-    <w:abstractNumId w:val="12"/>
+    <w:abstractNumId w:val="14"/>
   </w:num>
   <w:num w:numId="10" w16cid:durableId="1905993023">
     <w:abstractNumId w:val="5"/>
@@ -7591,43 +7710,43 @@
     <w:abstractNumId w:val="1"/>
   </w:num>
   <w:num w:numId="12" w16cid:durableId="1438254683">
-    <w:abstractNumId w:val="20"/>
+    <w:abstractNumId w:val="22"/>
   </w:num>
   <w:num w:numId="13" w16cid:durableId="1342246711">
+    <w:abstractNumId w:val="40"/>
+  </w:num>
+  <w:num w:numId="14" w16cid:durableId="898320651">
+    <w:abstractNumId w:val="29"/>
+  </w:num>
+  <w:num w:numId="15" w16cid:durableId="191650073">
     <w:abstractNumId w:val="38"/>
   </w:num>
-  <w:num w:numId="14" w16cid:durableId="898320651">
-    <w:abstractNumId w:val="27"/>
-  </w:num>
-  <w:num w:numId="15" w16cid:durableId="191650073">
-    <w:abstractNumId w:val="36"/>
-  </w:num>
   <w:num w:numId="16" w16cid:durableId="572355893">
-    <w:abstractNumId w:val="22"/>
+    <w:abstractNumId w:val="24"/>
   </w:num>
   <w:num w:numId="17" w16cid:durableId="1223567727">
-    <w:abstractNumId w:val="21"/>
+    <w:abstractNumId w:val="23"/>
   </w:num>
   <w:num w:numId="18" w16cid:durableId="489902461">
-    <w:abstractNumId w:val="17"/>
+    <w:abstractNumId w:val="19"/>
   </w:num>
   <w:num w:numId="19" w16cid:durableId="1432504722">
-    <w:abstractNumId w:val="31"/>
+    <w:abstractNumId w:val="33"/>
   </w:num>
   <w:num w:numId="20" w16cid:durableId="330766159">
-    <w:abstractNumId w:val="9"/>
+    <w:abstractNumId w:val="10"/>
   </w:num>
   <w:num w:numId="21" w16cid:durableId="881792581">
-    <w:abstractNumId w:val="35"/>
+    <w:abstractNumId w:val="37"/>
   </w:num>
   <w:num w:numId="22" w16cid:durableId="615647383">
     <w:abstractNumId w:val="0"/>
   </w:num>
   <w:num w:numId="23" w16cid:durableId="1846822853">
-    <w:abstractNumId w:val="16"/>
+    <w:abstractNumId w:val="18"/>
   </w:num>
   <w:num w:numId="24" w16cid:durableId="1456176523">
-    <w:abstractNumId w:val="10"/>
+    <w:abstractNumId w:val="11"/>
   </w:num>
   <w:num w:numId="25" w16cid:durableId="1256477171">
     <w:abstractNumId w:val="7"/>
@@ -7636,43 +7755,49 @@
     <w:abstractNumId w:val="6"/>
   </w:num>
   <w:num w:numId="27" w16cid:durableId="746652503">
-    <w:abstractNumId w:val="13"/>
+    <w:abstractNumId w:val="15"/>
   </w:num>
   <w:num w:numId="28" w16cid:durableId="953292683">
-    <w:abstractNumId w:val="23"/>
+    <w:abstractNumId w:val="25"/>
   </w:num>
   <w:num w:numId="29" w16cid:durableId="233928807">
-    <w:abstractNumId w:val="34"/>
+    <w:abstractNumId w:val="36"/>
   </w:num>
   <w:num w:numId="30" w16cid:durableId="1343433674">
-    <w:abstractNumId w:val="30"/>
+    <w:abstractNumId w:val="32"/>
   </w:num>
   <w:num w:numId="31" w16cid:durableId="1693802210">
     <w:abstractNumId w:val="4"/>
   </w:num>
   <w:num w:numId="32" w16cid:durableId="1759210149">
-    <w:abstractNumId w:val="24"/>
+    <w:abstractNumId w:val="26"/>
   </w:num>
   <w:num w:numId="33" w16cid:durableId="289477449">
     <w:abstractNumId w:val="2"/>
   </w:num>
   <w:num w:numId="34" w16cid:durableId="725447875">
-    <w:abstractNumId w:val="37"/>
+    <w:abstractNumId w:val="39"/>
   </w:num>
   <w:num w:numId="35" w16cid:durableId="1747871732">
     <w:abstractNumId w:val="8"/>
   </w:num>
   <w:num w:numId="36" w16cid:durableId="745034269">
-    <w:abstractNumId w:val="15"/>
+    <w:abstractNumId w:val="17"/>
   </w:num>
   <w:num w:numId="37" w16cid:durableId="1728601039">
-    <w:abstractNumId w:val="32"/>
+    <w:abstractNumId w:val="34"/>
   </w:num>
   <w:num w:numId="38" w16cid:durableId="151063216">
-    <w:abstractNumId w:val="33"/>
+    <w:abstractNumId w:val="35"/>
   </w:num>
   <w:num w:numId="39" w16cid:durableId="1270310067">
-    <w:abstractNumId w:val="29"/>
+    <w:abstractNumId w:val="31"/>
+  </w:num>
+  <w:num w:numId="40" w16cid:durableId="782305594">
+    <w:abstractNumId w:val="12"/>
+  </w:num>
+  <w:num w:numId="41" w16cid:durableId="1619333432">
+    <w:abstractNumId w:val="9"/>
   </w:num>
 </w:numbering>
 </file>
@@ -8280,7 +8405,6 @@
   <w:style w:type="character" w:default="1" w:styleId="Policepardfaut">
     <w:name w:val="Default Paragraph Font"/>
     <w:uiPriority w:val="1"/>
-    <w:semiHidden/>
     <w:unhideWhenUsed/>
   </w:style>
   <w:style w:type="table" w:default="1" w:styleId="TableauNormal">

</xml_diff>

<commit_message>
end of :theory of the entire workflow of transformers
</commit_message>
<xml_diff>
--- a/plan d'apprentissage.docx
+++ b/plan d'apprentissage.docx
@@ -1670,21 +1670,36 @@
           <w:ilvl w:val="0"/>
           <w:numId w:val="25"/>
         </w:numPr>
+        <w:rPr>
+          <w:highlight w:val="yellow"/>
+        </w:rPr>
       </w:pPr>
       <w:proofErr w:type="gramStart"/>
       <w:r>
+        <w:rPr>
+          <w:highlight w:val="yellow"/>
+        </w:rPr>
         <w:t>multi</w:t>
       </w:r>
       <w:proofErr w:type="gramEnd"/>
       <w:r>
+        <w:rPr>
+          <w:highlight w:val="yellow"/>
+        </w:rPr>
         <w:t>-</w:t>
       </w:r>
       <w:proofErr w:type="spellStart"/>
       <w:r>
+        <w:rPr>
+          <w:highlight w:val="yellow"/>
+        </w:rPr>
         <w:t>head</w:t>
       </w:r>
       <w:proofErr w:type="spellEnd"/>
       <w:r>
+        <w:rPr>
+          <w:highlight w:val="yellow"/>
+        </w:rPr>
         <w:t xml:space="preserve"> attention</w:t>
       </w:r>
     </w:p>
@@ -1694,19 +1709,31 @@
           <w:ilvl w:val="0"/>
           <w:numId w:val="25"/>
         </w:numPr>
+        <w:rPr>
+          <w:highlight w:val="yellow"/>
+        </w:rPr>
       </w:pPr>
       <w:proofErr w:type="spellStart"/>
       <w:proofErr w:type="gramStart"/>
       <w:r>
+        <w:rPr>
+          <w:highlight w:val="yellow"/>
+        </w:rPr>
         <w:t>positional</w:t>
       </w:r>
       <w:proofErr w:type="spellEnd"/>
       <w:proofErr w:type="gramEnd"/>
       <w:r>
+        <w:rPr>
+          <w:highlight w:val="yellow"/>
+        </w:rPr>
         <w:t xml:space="preserve"> </w:t>
       </w:r>
       <w:proofErr w:type="spellStart"/>
       <w:r>
+        <w:rPr>
+          <w:highlight w:val="yellow"/>
+        </w:rPr>
         <w:t>encoding</w:t>
       </w:r>
       <w:proofErr w:type="spellEnd"/>
@@ -1782,6 +1809,7 @@
       <w:pPr>
         <w:rPr>
           <w:highlight w:val="yellow"/>
+          <w:lang w:val="en-US"/>
         </w:rPr>
       </w:pPr>
       <w:r>
@@ -1790,6 +1818,7 @@
       <w:r>
         <w:rPr>
           <w:highlight w:val="yellow"/>
+          <w:lang w:val="en-US"/>
         </w:rPr>
         <w:t>- Architecture of transformer</w:t>
       </w:r>
@@ -1801,6 +1830,9 @@
         </w:rPr>
       </w:pPr>
       <w:r>
+        <w:rPr>
+          <w:lang w:val="en-US"/>
+        </w:rPr>
         <w:tab/>
       </w:r>
       <w:r>
@@ -1841,6 +1873,12 @@
           <w:lang w:val="en-US"/>
         </w:rPr>
         <w:tab/>
+      </w:r>
+      <w:r>
+        <w:rPr>
+          <w:highlight w:val="yellow"/>
+          <w:lang w:val="en-US"/>
+        </w:rPr>
         <w:t>- Positional encoding</w:t>
       </w:r>
     </w:p>
@@ -1855,6 +1893,12 @@
           <w:lang w:val="en-US"/>
         </w:rPr>
         <w:tab/>
+      </w:r>
+      <w:r>
+        <w:rPr>
+          <w:highlight w:val="yellow"/>
+          <w:lang w:val="en-US"/>
+        </w:rPr>
         <w:t>- Multi head attention</w:t>
       </w:r>
     </w:p>
@@ -1869,6 +1913,60 @@
           <w:lang w:val="en-US"/>
         </w:rPr>
         <w:tab/>
+      </w:r>
+      <w:r>
+        <w:rPr>
+          <w:highlight w:val="yellow"/>
+          <w:lang w:val="en-US"/>
+        </w:rPr>
+        <w:t>- layer normalization</w:t>
+      </w:r>
+    </w:p>
+    <w:p>
+      <w:pPr>
+        <w:rPr>
+          <w:highlight w:val="yellow"/>
+          <w:lang w:val="en-US"/>
+        </w:rPr>
+      </w:pPr>
+      <w:r>
+        <w:rPr>
+          <w:lang w:val="en-US"/>
+        </w:rPr>
+        <w:tab/>
+      </w:r>
+      <w:r>
+        <w:rPr>
+          <w:highlight w:val="yellow"/>
+          <w:lang w:val="en-US"/>
+        </w:rPr>
+        <w:t>- Masked multi head self attention</w:t>
+      </w:r>
+      <w:r>
+        <w:rPr>
+          <w:highlight w:val="yellow"/>
+          <w:lang w:val="en-US"/>
+        </w:rPr>
+        <w:t xml:space="preserve"> </w:t>
+      </w:r>
+    </w:p>
+    <w:p>
+      <w:pPr>
+        <w:rPr>
+          <w:lang w:val="en-US"/>
+        </w:rPr>
+      </w:pPr>
+      <w:r>
+        <w:rPr>
+          <w:lang w:val="en-US"/>
+        </w:rPr>
+        <w:tab/>
+      </w:r>
+      <w:r>
+        <w:rPr>
+          <w:highlight w:val="yellow"/>
+          <w:lang w:val="en-US"/>
+        </w:rPr>
         <w:t>- combining the working of transformers</w:t>
       </w:r>
     </w:p>

</xml_diff>